<commit_message>
Feature: Added support for prefix/@level and a single regex group in import config
</commit_message>
<xml_diff>
--- a/pso-docx-ant/src/test/import/cases/manual-numbering-true-prefix/manual-numbering-true-prefix.docx
+++ b/pso-docx-ant/src/test/import/cases/manual-numbering-true-prefix/manual-numbering-true-prefix.docx
@@ -1,6 +1,6 @@
 
 <file path=word/document.xml><?xml version="1.0" encoding="utf-8"?>
-<w:document xmlns:wpc="http://schemas.microsoft.com/office/word/2010/wordprocessingCanvas" xmlns:mc="http://schemas.openxmlformats.org/markup-compatibility/2006" xmlns:o="urn:schemas-microsoft-com:office:office" xmlns:r="http://schemas.openxmlformats.org/officeDocument/2006/relationships" xmlns:m="http://schemas.openxmlformats.org/officeDocument/2006/math" xmlns:v="urn:schemas-microsoft-com:vml" xmlns:wp14="http://schemas.microsoft.com/office/word/2010/wordprocessingDrawing" xmlns:wp="http://schemas.openxmlformats.org/drawingml/2006/wordprocessingDrawing" xmlns:w10="urn:schemas-microsoft-com:office:word" xmlns:w="http://schemas.openxmlformats.org/wordprocessingml/2006/main" xmlns:w14="http://schemas.microsoft.com/office/word/2010/wordml" xmlns:wpg="http://schemas.microsoft.com/office/word/2010/wordprocessingGroup" xmlns:wpi="http://schemas.microsoft.com/office/word/2010/wordprocessingInk" xmlns:wne="http://schemas.microsoft.com/office/word/2006/wordml" xmlns:wps="http://schemas.microsoft.com/office/word/2010/wordprocessingShape" mc:Ignorable="w14 wp14">
+<w:document xmlns:wpc="http://schemas.microsoft.com/office/word/2010/wordprocessingCanvas" xmlns:cx="http://schemas.microsoft.com/office/drawing/2014/chartex" xmlns:cx1="http://schemas.microsoft.com/office/drawing/2015/9/8/chartex" xmlns:cx2="http://schemas.microsoft.com/office/drawing/2015/10/21/chartex" xmlns:cx3="http://schemas.microsoft.com/office/drawing/2016/5/9/chartex" xmlns:cx4="http://schemas.microsoft.com/office/drawing/2016/5/10/chartex" xmlns:cx5="http://schemas.microsoft.com/office/drawing/2016/5/11/chartex" xmlns:cx6="http://schemas.microsoft.com/office/drawing/2016/5/12/chartex" xmlns:cx7="http://schemas.microsoft.com/office/drawing/2016/5/13/chartex" xmlns:cx8="http://schemas.microsoft.com/office/drawing/2016/5/14/chartex" xmlns:mc="http://schemas.openxmlformats.org/markup-compatibility/2006" xmlns:aink="http://schemas.microsoft.com/office/drawing/2016/ink" xmlns:am3d="http://schemas.microsoft.com/office/drawing/2017/model3d" xmlns:o="urn:schemas-microsoft-com:office:office" xmlns:oel="http://schemas.microsoft.com/office/2019/extlst" xmlns:r="http://schemas.openxmlformats.org/officeDocument/2006/relationships" xmlns:m="http://schemas.openxmlformats.org/officeDocument/2006/math" xmlns:v="urn:schemas-microsoft-com:vml" xmlns:wp14="http://schemas.microsoft.com/office/word/2010/wordprocessingDrawing" xmlns:wp="http://schemas.openxmlformats.org/drawingml/2006/wordprocessingDrawing" xmlns:w10="urn:schemas-microsoft-com:office:word" xmlns:w="http://schemas.openxmlformats.org/wordprocessingml/2006/main" xmlns:w14="http://schemas.microsoft.com/office/word/2010/wordml" xmlns:w15="http://schemas.microsoft.com/office/word/2012/wordml" xmlns:w16cex="http://schemas.microsoft.com/office/word/2018/wordml/cex" xmlns:w16cid="http://schemas.microsoft.com/office/word/2016/wordml/cid" xmlns:w16="http://schemas.microsoft.com/office/word/2018/wordml" xmlns:w16du="http://schemas.microsoft.com/office/word/2023/wordml/word16du" xmlns:w16sdtdh="http://schemas.microsoft.com/office/word/2020/wordml/sdtdatahash" xmlns:w16sdtfl="http://schemas.microsoft.com/office/word/2024/wordml/sdtformatlock" xmlns:w16se="http://schemas.microsoft.com/office/word/2015/wordml/symex" xmlns:wpg="http://schemas.microsoft.com/office/word/2010/wordprocessingGroup" xmlns:wpi="http://schemas.microsoft.com/office/word/2010/wordprocessingInk" xmlns:wne="http://schemas.microsoft.com/office/word/2006/wordml" xmlns:wps="http://schemas.microsoft.com/office/word/2010/wordprocessingShape" mc:Ignorable="w14 w15 w16se w16cid w16 w16cex w16sdtdh w16sdtfl w16du wp14">
   <w:body>
     <w:p>
       <w:r>
@@ -52,7 +52,10 @@
         <w:t>Schedule 1</w:t>
       </w:r>
       <w:r>
-        <w:t>—</w:t>
+        <w:rPr>
+          <w:rStyle w:val="CharAmSchNo"/>
+        </w:rPr>
+        <w:tab/>
       </w:r>
       <w:r>
         <w:rPr>
@@ -77,7 +80,10 @@
         <w:t>Part 1</w:t>
       </w:r>
       <w:r>
-        <w:t>—</w:t>
+        <w:rPr>
+          <w:rStyle w:val="CharAmPartNo"/>
+        </w:rPr>
+        <w:tab/>
       </w:r>
       <w:r>
         <w:rPr>
@@ -96,6 +102,18 @@
       </w:pPr>
       <w:bookmarkStart w:id="4" w:name="_Toc384987633"/>
       <w:r>
+        <w:t>Section</w:t>
+      </w:r>
+      <w:r>
+        <w:t> </w:t>
+      </w:r>
+      <w:r>
+        <w:t>1</w:t>
+      </w:r>
+      <w:r>
+        <w:tab/>
+      </w:r>
+      <w:r>
         <w:t>Private Health Insurance Act 2007</w:t>
       </w:r>
       <w:bookmarkEnd w:id="4"/>
@@ -148,7 +166,7 @@
     </w:p>
     <w:p>
       <w:pPr>
-        <w:pStyle w:val="Item"/>
+        <w:pStyle w:val="paragraph"/>
       </w:pPr>
       <w:r>
         <w:t>Insert:</w:t>
@@ -172,14 +190,7 @@
       </w:r>
       <w:r>
         <w:tab/>
-      </w:r>
-      <w:proofErr w:type="gramStart"/>
-      <w:r>
-        <w:t>For</w:t>
-      </w:r>
-      <w:proofErr w:type="gramEnd"/>
-      <w:r>
-        <w:t xml:space="preserve"> each adjustment year, each percentage specified in subsection (1), (2) or (3) is replaced by the percentage worked out as follows:</w:t>
+        <w:t>For each adjustment year, each percentage specified in subsection (1), (2) or (3) is replaced by the percentage worked out as follows:</w:t>
       </w:r>
     </w:p>
     <w:p>
@@ -192,14 +203,7 @@
       </w:r>
       <w:r>
         <w:tab/>
-      </w:r>
-      <w:proofErr w:type="gramStart"/>
-      <w:r>
-        <w:t>for</w:t>
-      </w:r>
-      <w:proofErr w:type="gramEnd"/>
-      <w:r>
-        <w:t xml:space="preserve"> the adjustment year starting on 1 April 2014—multiply the specified percentage by the adjustment factor for the adjustment year;</w:t>
+        <w:t>for the adjustment year starting on 1 April 2014—multiply the specified percentage by the adjustment factor for the adjustment year;</w:t>
       </w:r>
     </w:p>
     <w:p>
@@ -212,19 +216,12 @@
       </w:r>
       <w:r>
         <w:tab/>
-      </w:r>
-      <w:proofErr w:type="gramStart"/>
-      <w:r>
-        <w:t>for</w:t>
-      </w:r>
-      <w:proofErr w:type="gramEnd"/>
-      <w:r>
-        <w:t xml:space="preserve"> a later adjustment year—multiply the specified percentage, as worked out under this subsection for the preceding adjustment year, by the adjustment factor for the later adjustment year.</w:t>
-      </w:r>
-    </w:p>
-    <w:p>
-      <w:pPr>
-        <w:pStyle w:val="subsection"/>
+        <w:t>for a later adjustment year—multiply the specified percentage, as worked out under this subsection for the preceding adjustment year, by the adjustment factor for the later adjustment year.</w:t>
+      </w:r>
+    </w:p>
+    <w:p>
+      <w:pPr>
+        <w:pStyle w:val="BodyText"/>
       </w:pPr>
       <w:r>
         <w:tab/>
@@ -254,18 +251,14 @@
       </w:pPr>
       <w:r>
         <w:tab/>
-        <w:t>(5D)</w:t>
+        <w:t>5D</w:t>
+      </w:r>
+      <w:r>
+        <w:t>|</w:t>
       </w:r>
       <w:r>
         <w:tab/>
-      </w:r>
-      <w:proofErr w:type="gramStart"/>
-      <w:r>
-        <w:t>Each</w:t>
-      </w:r>
-      <w:proofErr w:type="gramEnd"/>
-      <w:r>
-        <w:t xml:space="preserve"> of the following is an </w:t>
+        <w:t xml:space="preserve">Each of the following is an </w:t>
       </w:r>
       <w:r>
         <w:rPr>
@@ -284,18 +277,16 @@
       </w:pPr>
       <w:r>
         <w:tab/>
-        <w:t>(a)</w:t>
+      </w:r>
+      <w:r>
+        <w:t>A</w:t>
+      </w:r>
+      <w:r>
+        <w:t>||</w:t>
       </w:r>
       <w:r>
         <w:tab/>
-      </w:r>
-      <w:proofErr w:type="gramStart"/>
-      <w:r>
-        <w:t>the</w:t>
-      </w:r>
-      <w:proofErr w:type="gramEnd"/>
-      <w:r>
-        <w:t xml:space="preserve"> period of 12 months starting on 1 April 2014;</w:t>
+        <w:t>the period of 12 months starting on 1 April 2014;</w:t>
       </w:r>
     </w:p>
     <w:p>
@@ -304,18 +295,16 @@
       </w:pPr>
       <w:r>
         <w:tab/>
-        <w:t>(b)</w:t>
+      </w:r>
+      <w:r>
+        <w:t>B</w:t>
+      </w:r>
+      <w:r>
+        <w:t>||</w:t>
       </w:r>
       <w:r>
         <w:tab/>
-      </w:r>
-      <w:proofErr w:type="gramStart"/>
-      <w:r>
-        <w:t>the</w:t>
-      </w:r>
-      <w:proofErr w:type="gramEnd"/>
-      <w:r>
-        <w:t xml:space="preserve"> period of 12 months starting on each later 1 April.</w:t>
+        <w:t>the period of 12 months starting on each later 1 April.</w:t>
       </w:r>
     </w:p>
     <w:p>
@@ -328,30 +317,14 @@
       </w:r>
       <w:r>
         <w:tab/>
-      </w:r>
-      <w:proofErr w:type="gramStart"/>
-      <w:r>
-        <w:t>The</w:t>
-      </w:r>
-      <w:proofErr w:type="gramEnd"/>
-      <w:r>
-        <w:t xml:space="preserve"> </w:t>
+        <w:t xml:space="preserve">The </w:t>
       </w:r>
       <w:r>
         <w:rPr>
           <w:b/>
           <w:i/>
         </w:rPr>
-        <w:t>adjustment fact</w:t>
-      </w:r>
-      <w:bookmarkStart w:id="5" w:name="_GoBack"/>
-      <w:bookmarkEnd w:id="5"/>
-      <w:r>
-        <w:rPr>
-          <w:b/>
-          <w:i/>
-        </w:rPr>
-        <w:t xml:space="preserve">or </w:t>
+        <w:t xml:space="preserve">adjustment factor </w:t>
       </w:r>
       <w:r>
         <w:t xml:space="preserve">for an adjustment year is to be determined in accordance with the Private Health Insurance (Incentives) Rules. However, if the factor so determined for an adjustment year is more than 1, the </w:t>
@@ -419,51 +392,33 @@
       <w:pPr>
         <w:pStyle w:val="Definition"/>
       </w:pPr>
-      <w:proofErr w:type="gramStart"/>
       <w:r>
         <w:rPr>
           <w:b/>
           <w:i/>
         </w:rPr>
-        <w:t>adjustment</w:t>
-      </w:r>
-      <w:proofErr w:type="gramEnd"/>
+        <w:t>adjustment factor</w:t>
+      </w:r>
+      <w:r>
+        <w:t xml:space="preserve"> for an adjustment year has the meaning given by subsection 22</w:t>
+      </w:r>
+      <w:r>
+        <w:noBreakHyphen/>
+      </w:r>
+      <w:r>
+        <w:t>15(5E).</w:t>
+      </w:r>
+    </w:p>
+    <w:p>
+      <w:pPr>
+        <w:pStyle w:val="Definition"/>
+      </w:pPr>
       <w:r>
         <w:rPr>
           <w:b/>
           <w:i/>
         </w:rPr>
-        <w:t xml:space="preserve"> factor</w:t>
-      </w:r>
-      <w:r>
-        <w:t xml:space="preserve"> for an adjustment year has the meaning given by subsection 22</w:t>
-      </w:r>
-      <w:r>
-        <w:noBreakHyphen/>
-      </w:r>
-      <w:r>
-        <w:t>15(5E).</w:t>
-      </w:r>
-    </w:p>
-    <w:p>
-      <w:pPr>
-        <w:pStyle w:val="Definition"/>
-      </w:pPr>
-      <w:proofErr w:type="gramStart"/>
-      <w:r>
-        <w:rPr>
-          <w:b/>
-          <w:i/>
-        </w:rPr>
-        <w:t>adjustment</w:t>
-      </w:r>
-      <w:proofErr w:type="gramEnd"/>
-      <w:r>
-        <w:rPr>
-          <w:b/>
-          <w:i/>
-        </w:rPr>
-        <w:t xml:space="preserve"> year</w:t>
+        <w:t>adjustment year</w:t>
       </w:r>
       <w:r>
         <w:t xml:space="preserve"> has the meaning given by subsection 22</w:t>
@@ -702,8 +657,8 @@
 </file>
 
 <file path=word/numbering.xml><?xml version="1.0" encoding="utf-8"?>
-<w:numbering xmlns:wpc="http://schemas.microsoft.com/office/word/2010/wordprocessingCanvas" xmlns:mc="http://schemas.openxmlformats.org/markup-compatibility/2006" xmlns:o="urn:schemas-microsoft-com:office:office" xmlns:r="http://schemas.openxmlformats.org/officeDocument/2006/relationships" xmlns:m="http://schemas.openxmlformats.org/officeDocument/2006/math" xmlns:v="urn:schemas-microsoft-com:vml" xmlns:wp14="http://schemas.microsoft.com/office/word/2010/wordprocessingDrawing" xmlns:wp="http://schemas.openxmlformats.org/drawingml/2006/wordprocessingDrawing" xmlns:w10="urn:schemas-microsoft-com:office:word" xmlns:w="http://schemas.openxmlformats.org/wordprocessingml/2006/main" xmlns:w14="http://schemas.microsoft.com/office/word/2010/wordml" xmlns:wpg="http://schemas.microsoft.com/office/word/2010/wordprocessingGroup" xmlns:wpi="http://schemas.microsoft.com/office/word/2010/wordprocessingInk" xmlns:wne="http://schemas.microsoft.com/office/word/2006/wordml" xmlns:wps="http://schemas.microsoft.com/office/word/2010/wordprocessingShape" mc:Ignorable="w14 wp14">
-  <w:abstractNum w:abstractNumId="0">
+<w:numbering xmlns:wpc="http://schemas.microsoft.com/office/word/2010/wordprocessingCanvas" xmlns:cx="http://schemas.microsoft.com/office/drawing/2014/chartex" xmlns:cx1="http://schemas.microsoft.com/office/drawing/2015/9/8/chartex" xmlns:cx2="http://schemas.microsoft.com/office/drawing/2015/10/21/chartex" xmlns:cx3="http://schemas.microsoft.com/office/drawing/2016/5/9/chartex" xmlns:cx4="http://schemas.microsoft.com/office/drawing/2016/5/10/chartex" xmlns:cx5="http://schemas.microsoft.com/office/drawing/2016/5/11/chartex" xmlns:cx6="http://schemas.microsoft.com/office/drawing/2016/5/12/chartex" xmlns:cx7="http://schemas.microsoft.com/office/drawing/2016/5/13/chartex" xmlns:cx8="http://schemas.microsoft.com/office/drawing/2016/5/14/chartex" xmlns:mc="http://schemas.openxmlformats.org/markup-compatibility/2006" xmlns:aink="http://schemas.microsoft.com/office/drawing/2016/ink" xmlns:am3d="http://schemas.microsoft.com/office/drawing/2017/model3d" xmlns:o="urn:schemas-microsoft-com:office:office" xmlns:oel="http://schemas.microsoft.com/office/2019/extlst" xmlns:r="http://schemas.openxmlformats.org/officeDocument/2006/relationships" xmlns:m="http://schemas.openxmlformats.org/officeDocument/2006/math" xmlns:v="urn:schemas-microsoft-com:vml" xmlns:wp14="http://schemas.microsoft.com/office/word/2010/wordprocessingDrawing" xmlns:wp="http://schemas.openxmlformats.org/drawingml/2006/wordprocessingDrawing" xmlns:w10="urn:schemas-microsoft-com:office:word" xmlns:w="http://schemas.openxmlformats.org/wordprocessingml/2006/main" xmlns:w14="http://schemas.microsoft.com/office/word/2010/wordml" xmlns:w15="http://schemas.microsoft.com/office/word/2012/wordml" xmlns:w16cex="http://schemas.microsoft.com/office/word/2018/wordml/cex" xmlns:w16cid="http://schemas.microsoft.com/office/word/2016/wordml/cid" xmlns:w16="http://schemas.microsoft.com/office/word/2018/wordml" xmlns:w16du="http://schemas.microsoft.com/office/word/2023/wordml/word16du" xmlns:w16sdtdh="http://schemas.microsoft.com/office/word/2020/wordml/sdtdatahash" xmlns:w16sdtfl="http://schemas.microsoft.com/office/word/2024/wordml/sdtformatlock" xmlns:w16se="http://schemas.microsoft.com/office/word/2015/wordml/symex" xmlns:wpg="http://schemas.microsoft.com/office/word/2010/wordprocessingGroup" xmlns:wpi="http://schemas.microsoft.com/office/word/2010/wordprocessingInk" xmlns:wne="http://schemas.microsoft.com/office/word/2006/wordml" xmlns:wps="http://schemas.microsoft.com/office/word/2010/wordprocessingShape" mc:Ignorable="w14 w15 w16se w16cid w16 w16cex w16sdtdh w16sdtfl w16du wp14">
+  <w:abstractNum w:abstractNumId="0" w15:restartNumberingAfterBreak="0">
     <w:nsid w:val="FFFFFF7C"/>
     <w:multiLevelType w:val="singleLevel"/>
     <w:tmpl w:val="C4F09E42"/>
@@ -721,7 +676,7 @@
       </w:pPr>
     </w:lvl>
   </w:abstractNum>
-  <w:abstractNum w:abstractNumId="1">
+  <w:abstractNum w:abstractNumId="1" w15:restartNumberingAfterBreak="0">
     <w:nsid w:val="FFFFFF7D"/>
     <w:multiLevelType w:val="singleLevel"/>
     <w:tmpl w:val="FCAE443C"/>
@@ -739,7 +694,7 @@
       </w:pPr>
     </w:lvl>
   </w:abstractNum>
-  <w:abstractNum w:abstractNumId="2">
+  <w:abstractNum w:abstractNumId="2" w15:restartNumberingAfterBreak="0">
     <w:nsid w:val="FFFFFF7E"/>
     <w:multiLevelType w:val="singleLevel"/>
     <w:tmpl w:val="33E8BDAC"/>
@@ -757,7 +712,7 @@
       </w:pPr>
     </w:lvl>
   </w:abstractNum>
-  <w:abstractNum w:abstractNumId="3">
+  <w:abstractNum w:abstractNumId="3" w15:restartNumberingAfterBreak="0">
     <w:nsid w:val="FFFFFF7F"/>
     <w:multiLevelType w:val="singleLevel"/>
     <w:tmpl w:val="4DF63920"/>
@@ -775,7 +730,7 @@
       </w:pPr>
     </w:lvl>
   </w:abstractNum>
-  <w:abstractNum w:abstractNumId="4">
+  <w:abstractNum w:abstractNumId="4" w15:restartNumberingAfterBreak="0">
     <w:nsid w:val="FFFFFF80"/>
     <w:multiLevelType w:val="singleLevel"/>
     <w:tmpl w:val="2BB63032"/>
@@ -796,7 +751,7 @@
       </w:rPr>
     </w:lvl>
   </w:abstractNum>
-  <w:abstractNum w:abstractNumId="5">
+  <w:abstractNum w:abstractNumId="5" w15:restartNumberingAfterBreak="0">
     <w:nsid w:val="FFFFFF81"/>
     <w:multiLevelType w:val="singleLevel"/>
     <w:tmpl w:val="1C10109A"/>
@@ -817,7 +772,7 @@
       </w:rPr>
     </w:lvl>
   </w:abstractNum>
-  <w:abstractNum w:abstractNumId="6">
+  <w:abstractNum w:abstractNumId="6" w15:restartNumberingAfterBreak="0">
     <w:nsid w:val="FFFFFF82"/>
     <w:multiLevelType w:val="singleLevel"/>
     <w:tmpl w:val="B3F42F2E"/>
@@ -838,7 +793,7 @@
       </w:rPr>
     </w:lvl>
   </w:abstractNum>
-  <w:abstractNum w:abstractNumId="7">
+  <w:abstractNum w:abstractNumId="7" w15:restartNumberingAfterBreak="0">
     <w:nsid w:val="FFFFFF83"/>
     <w:multiLevelType w:val="singleLevel"/>
     <w:tmpl w:val="B194F96E"/>
@@ -859,7 +814,7 @@
       </w:rPr>
     </w:lvl>
   </w:abstractNum>
-  <w:abstractNum w:abstractNumId="8">
+  <w:abstractNum w:abstractNumId="8" w15:restartNumberingAfterBreak="0">
     <w:nsid w:val="FFFFFF88"/>
     <w:multiLevelType w:val="singleLevel"/>
     <w:tmpl w:val="9B54619C"/>
@@ -877,7 +832,7 @@
       </w:pPr>
     </w:lvl>
   </w:abstractNum>
-  <w:abstractNum w:abstractNumId="9">
+  <w:abstractNum w:abstractNumId="9" w15:restartNumberingAfterBreak="0">
     <w:nsid w:val="FFFFFF89"/>
     <w:multiLevelType w:val="singleLevel"/>
     <w:tmpl w:val="C256FCAC"/>
@@ -898,7 +853,7 @@
       </w:rPr>
     </w:lvl>
   </w:abstractNum>
-  <w:abstractNum w:abstractNumId="10">
+  <w:abstractNum w:abstractNumId="10" w15:restartNumberingAfterBreak="0">
     <w:nsid w:val="0E690054"/>
     <w:multiLevelType w:val="multilevel"/>
     <w:tmpl w:val="0C09001F"/>
@@ -984,7 +939,7 @@
       </w:pPr>
     </w:lvl>
   </w:abstractNum>
-  <w:abstractNum w:abstractNumId="11">
+  <w:abstractNum w:abstractNumId="11" w15:restartNumberingAfterBreak="0">
     <w:nsid w:val="14B80FF5"/>
     <w:multiLevelType w:val="multilevel"/>
     <w:tmpl w:val="0C090021"/>
@@ -1097,7 +1052,7 @@
       </w:rPr>
     </w:lvl>
   </w:abstractNum>
-  <w:abstractNum w:abstractNumId="12">
+  <w:abstractNum w:abstractNumId="12" w15:restartNumberingAfterBreak="0">
     <w:nsid w:val="2CC77C2B"/>
     <w:multiLevelType w:val="multilevel"/>
     <w:tmpl w:val="0C09001F"/>
@@ -1183,7 +1138,7 @@
       </w:pPr>
     </w:lvl>
   </w:abstractNum>
-  <w:abstractNum w:abstractNumId="13">
+  <w:abstractNum w:abstractNumId="13" w15:restartNumberingAfterBreak="0">
     <w:nsid w:val="39A23241"/>
     <w:multiLevelType w:val="multilevel"/>
     <w:tmpl w:val="0C090021"/>
@@ -1296,7 +1251,7 @@
       </w:rPr>
     </w:lvl>
   </w:abstractNum>
-  <w:abstractNum w:abstractNumId="14">
+  <w:abstractNum w:abstractNumId="14" w15:restartNumberingAfterBreak="0">
     <w:nsid w:val="5BED5F68"/>
     <w:multiLevelType w:val="hybridMultilevel"/>
     <w:tmpl w:val="A846F3CA"/>
@@ -1409,7 +1364,7 @@
       </w:rPr>
     </w:lvl>
   </w:abstractNum>
-  <w:abstractNum w:abstractNumId="15">
+  <w:abstractNum w:abstractNumId="15" w15:restartNumberingAfterBreak="0">
     <w:nsid w:val="63F73B10"/>
     <w:multiLevelType w:val="multilevel"/>
     <w:tmpl w:val="0C09001F"/>
@@ -1495,7 +1450,7 @@
       </w:pPr>
     </w:lvl>
   </w:abstractNum>
-  <w:abstractNum w:abstractNumId="16">
+  <w:abstractNum w:abstractNumId="16" w15:restartNumberingAfterBreak="0">
     <w:nsid w:val="6A5218F1"/>
     <w:multiLevelType w:val="multilevel"/>
     <w:tmpl w:val="0C090021"/>
@@ -1608,7 +1563,7 @@
       </w:rPr>
     </w:lvl>
   </w:abstractNum>
-  <w:abstractNum w:abstractNumId="17">
+  <w:abstractNum w:abstractNumId="17" w15:restartNumberingAfterBreak="0">
     <w:nsid w:val="74D27ACB"/>
     <w:multiLevelType w:val="multilevel"/>
     <w:tmpl w:val="0C090021"/>
@@ -1721,7 +1676,7 @@
       </w:rPr>
     </w:lvl>
   </w:abstractNum>
-  <w:abstractNum w:abstractNumId="18">
+  <w:abstractNum w:abstractNumId="18" w15:restartNumberingAfterBreak="0">
     <w:nsid w:val="7D9217F1"/>
     <w:multiLevelType w:val="multilevel"/>
     <w:tmpl w:val="0C09001F"/>
@@ -1807,68 +1762,68 @@
       </w:pPr>
     </w:lvl>
   </w:abstractNum>
-  <w:num w:numId="1">
+  <w:num w:numId="1" w16cid:durableId="2116821710">
     <w:abstractNumId w:val="13"/>
   </w:num>
-  <w:num w:numId="2">
+  <w:num w:numId="2" w16cid:durableId="619799145">
     <w:abstractNumId w:val="17"/>
   </w:num>
-  <w:num w:numId="3">
+  <w:num w:numId="3" w16cid:durableId="923958357">
     <w:abstractNumId w:val="11"/>
   </w:num>
-  <w:num w:numId="4">
+  <w:num w:numId="4" w16cid:durableId="1695840567">
     <w:abstractNumId w:val="16"/>
   </w:num>
-  <w:num w:numId="5">
+  <w:num w:numId="5" w16cid:durableId="1638073951">
     <w:abstractNumId w:val="10"/>
   </w:num>
-  <w:num w:numId="6">
+  <w:num w:numId="6" w16cid:durableId="1578172606">
     <w:abstractNumId w:val="12"/>
   </w:num>
-  <w:num w:numId="7">
+  <w:num w:numId="7" w16cid:durableId="1993680787">
     <w:abstractNumId w:val="15"/>
   </w:num>
-  <w:num w:numId="8">
+  <w:num w:numId="8" w16cid:durableId="954872202">
     <w:abstractNumId w:val="18"/>
   </w:num>
-  <w:num w:numId="9">
+  <w:num w:numId="9" w16cid:durableId="696783693">
     <w:abstractNumId w:val="9"/>
   </w:num>
-  <w:num w:numId="10">
+  <w:num w:numId="10" w16cid:durableId="743717893">
     <w:abstractNumId w:val="7"/>
   </w:num>
-  <w:num w:numId="11">
+  <w:num w:numId="11" w16cid:durableId="1608154430">
     <w:abstractNumId w:val="6"/>
   </w:num>
-  <w:num w:numId="12">
+  <w:num w:numId="12" w16cid:durableId="1170869588">
     <w:abstractNumId w:val="5"/>
   </w:num>
-  <w:num w:numId="13">
+  <w:num w:numId="13" w16cid:durableId="1010110265">
     <w:abstractNumId w:val="4"/>
   </w:num>
-  <w:num w:numId="14">
+  <w:num w:numId="14" w16cid:durableId="88087222">
     <w:abstractNumId w:val="8"/>
   </w:num>
-  <w:num w:numId="15">
+  <w:num w:numId="15" w16cid:durableId="778187712">
     <w:abstractNumId w:val="3"/>
   </w:num>
-  <w:num w:numId="16">
+  <w:num w:numId="16" w16cid:durableId="1373844263">
     <w:abstractNumId w:val="2"/>
   </w:num>
-  <w:num w:numId="17">
+  <w:num w:numId="17" w16cid:durableId="740559902">
     <w:abstractNumId w:val="1"/>
   </w:num>
-  <w:num w:numId="18">
+  <w:num w:numId="18" w16cid:durableId="402919724">
     <w:abstractNumId w:val="0"/>
   </w:num>
-  <w:num w:numId="19">
+  <w:num w:numId="19" w16cid:durableId="967514855">
     <w:abstractNumId w:val="14"/>
   </w:num>
 </w:numbering>
 </file>
 
 <file path=word/styles.xml><?xml version="1.0" encoding="utf-8"?>
-<w:styles xmlns:mc="http://schemas.openxmlformats.org/markup-compatibility/2006" xmlns:r="http://schemas.openxmlformats.org/officeDocument/2006/relationships" xmlns:w="http://schemas.openxmlformats.org/wordprocessingml/2006/main" xmlns:w14="http://schemas.microsoft.com/office/word/2010/wordml" mc:Ignorable="w14">
+<w:styles xmlns:mc="http://schemas.openxmlformats.org/markup-compatibility/2006" xmlns:r="http://schemas.openxmlformats.org/officeDocument/2006/relationships" xmlns:w="http://schemas.openxmlformats.org/wordprocessingml/2006/main" xmlns:w14="http://schemas.microsoft.com/office/word/2010/wordml" xmlns:w15="http://schemas.microsoft.com/office/word/2012/wordml" xmlns:w16cex="http://schemas.microsoft.com/office/word/2018/wordml/cex" xmlns:w16cid="http://schemas.microsoft.com/office/word/2016/wordml/cid" xmlns:w16="http://schemas.microsoft.com/office/word/2018/wordml" xmlns:w16du="http://schemas.microsoft.com/office/word/2023/wordml/word16du" xmlns:w16sdtdh="http://schemas.microsoft.com/office/word/2020/wordml/sdtdatahash" xmlns:w16sdtfl="http://schemas.microsoft.com/office/word/2024/wordml/sdtformatlock" xmlns:w16se="http://schemas.microsoft.com/office/word/2015/wordml/symex" mc:Ignorable="w14 w15 w16se w16cid w16 w16cex w16sdtdh w16sdtfl w16du">
   <w:docDefaults>
     <w:rPrDefault>
       <w:rPr>
@@ -1884,144 +1839,383 @@
       </w:pPr>
     </w:pPrDefault>
   </w:docDefaults>
-  <w:latentStyles w:defLockedState="0" w:defUIPriority="99" w:defSemiHidden="1" w:defUnhideWhenUsed="1" w:defQFormat="0" w:count="267">
-    <w:lsdException w:name="Normal" w:semiHidden="0" w:uiPriority="0" w:unhideWhenUsed="0" w:qFormat="1"/>
-    <w:lsdException w:name="heading 1" w:semiHidden="0" w:uiPriority="9" w:unhideWhenUsed="0" w:qFormat="1"/>
-    <w:lsdException w:name="heading 2" w:uiPriority="9" w:qFormat="1"/>
-    <w:lsdException w:name="heading 3" w:uiPriority="9" w:qFormat="1"/>
-    <w:lsdException w:name="heading 4" w:uiPriority="9" w:qFormat="1"/>
-    <w:lsdException w:name="heading 5" w:uiPriority="9" w:qFormat="1"/>
-    <w:lsdException w:name="heading 6" w:uiPriority="9" w:qFormat="1"/>
-    <w:lsdException w:name="heading 7" w:uiPriority="9" w:qFormat="1"/>
-    <w:lsdException w:name="heading 8" w:uiPriority="9" w:qFormat="1"/>
-    <w:lsdException w:name="heading 9" w:uiPriority="9" w:qFormat="1"/>
-    <w:lsdException w:name="toc 1" w:uiPriority="39"/>
-    <w:lsdException w:name="toc 2" w:uiPriority="39"/>
-    <w:lsdException w:name="toc 3" w:uiPriority="39"/>
-    <w:lsdException w:name="toc 4" w:uiPriority="39"/>
-    <w:lsdException w:name="toc 5" w:uiPriority="39"/>
-    <w:lsdException w:name="toc 6" w:uiPriority="39"/>
-    <w:lsdException w:name="toc 7" w:uiPriority="39"/>
-    <w:lsdException w:name="toc 8" w:uiPriority="39"/>
-    <w:lsdException w:name="toc 9" w:uiPriority="39"/>
-    <w:lsdException w:name="caption" w:uiPriority="35" w:qFormat="1"/>
-    <w:lsdException w:name="Title" w:semiHidden="0" w:uiPriority="10" w:unhideWhenUsed="0" w:qFormat="1"/>
-    <w:lsdException w:name="Default Paragraph Font" w:uiPriority="1"/>
-    <w:lsdException w:name="Subtitle" w:semiHidden="0" w:uiPriority="11" w:unhideWhenUsed="0" w:qFormat="1"/>
-    <w:lsdException w:name="Strong" w:semiHidden="0" w:uiPriority="22" w:unhideWhenUsed="0" w:qFormat="1"/>
-    <w:lsdException w:name="Emphasis" w:semiHidden="0" w:uiPriority="20" w:unhideWhenUsed="0" w:qFormat="1"/>
-    <w:lsdException w:name="Table Grid" w:semiHidden="0" w:uiPriority="59" w:unhideWhenUsed="0"/>
-    <w:lsdException w:name="Placeholder Text" w:unhideWhenUsed="0"/>
-    <w:lsdException w:name="No Spacing" w:semiHidden="0" w:uiPriority="1" w:unhideWhenUsed="0" w:qFormat="1"/>
-    <w:lsdException w:name="Light Shading" w:semiHidden="0" w:uiPriority="60" w:unhideWhenUsed="0"/>
-    <w:lsdException w:name="Light List" w:semiHidden="0" w:uiPriority="61" w:unhideWhenUsed="0"/>
-    <w:lsdException w:name="Light Grid" w:semiHidden="0" w:uiPriority="62" w:unhideWhenUsed="0"/>
-    <w:lsdException w:name="Medium Shading 1" w:semiHidden="0" w:uiPriority="63" w:unhideWhenUsed="0"/>
-    <w:lsdException w:name="Medium Shading 2" w:semiHidden="0" w:uiPriority="64" w:unhideWhenUsed="0"/>
-    <w:lsdException w:name="Medium List 1" w:semiHidden="0" w:uiPriority="65" w:unhideWhenUsed="0"/>
-    <w:lsdException w:name="Medium List 2" w:semiHidden="0" w:uiPriority="66" w:unhideWhenUsed="0"/>
-    <w:lsdException w:name="Medium Grid 1" w:semiHidden="0" w:uiPriority="67" w:unhideWhenUsed="0"/>
-    <w:lsdException w:name="Medium Grid 2" w:semiHidden="0" w:uiPriority="68" w:unhideWhenUsed="0"/>
-    <w:lsdException w:name="Medium Grid 3" w:semiHidden="0" w:uiPriority="69" w:unhideWhenUsed="0"/>
-    <w:lsdException w:name="Dark List" w:semiHidden="0" w:uiPriority="70" w:unhideWhenUsed="0"/>
-    <w:lsdException w:name="Colorful Shading" w:semiHidden="0" w:uiPriority="71" w:unhideWhenUsed="0"/>
-    <w:lsdException w:name="Colorful List" w:semiHidden="0" w:uiPriority="72" w:unhideWhenUsed="0"/>
-    <w:lsdException w:name="Colorful Grid" w:semiHidden="0" w:uiPriority="73" w:unhideWhenUsed="0"/>
-    <w:lsdException w:name="Light Shading Accent 1" w:semiHidden="0" w:uiPriority="60" w:unhideWhenUsed="0"/>
-    <w:lsdException w:name="Light List Accent 1" w:semiHidden="0" w:uiPriority="61" w:unhideWhenUsed="0"/>
-    <w:lsdException w:name="Light Grid Accent 1" w:semiHidden="0" w:uiPriority="62" w:unhideWhenUsed="0"/>
-    <w:lsdException w:name="Medium Shading 1 Accent 1" w:semiHidden="0" w:uiPriority="63" w:unhideWhenUsed="0"/>
-    <w:lsdException w:name="Medium Shading 2 Accent 1" w:semiHidden="0" w:uiPriority="64" w:unhideWhenUsed="0"/>
-    <w:lsdException w:name="Medium List 1 Accent 1" w:semiHidden="0" w:uiPriority="65" w:unhideWhenUsed="0"/>
-    <w:lsdException w:name="Revision" w:unhideWhenUsed="0"/>
-    <w:lsdException w:name="List Paragraph" w:semiHidden="0" w:uiPriority="34" w:unhideWhenUsed="0" w:qFormat="1"/>
-    <w:lsdException w:name="Quote" w:semiHidden="0" w:uiPriority="29" w:unhideWhenUsed="0" w:qFormat="1"/>
-    <w:lsdException w:name="Intense Quote" w:semiHidden="0" w:uiPriority="30" w:unhideWhenUsed="0" w:qFormat="1"/>
-    <w:lsdException w:name="Medium List 2 Accent 1" w:semiHidden="0" w:uiPriority="66" w:unhideWhenUsed="0"/>
-    <w:lsdException w:name="Medium Grid 1 Accent 1" w:semiHidden="0" w:uiPriority="67" w:unhideWhenUsed="0"/>
-    <w:lsdException w:name="Medium Grid 2 Accent 1" w:semiHidden="0" w:uiPriority="68" w:unhideWhenUsed="0"/>
-    <w:lsdException w:name="Medium Grid 3 Accent 1" w:semiHidden="0" w:uiPriority="69" w:unhideWhenUsed="0"/>
-    <w:lsdException w:name="Dark List Accent 1" w:semiHidden="0" w:uiPriority="70" w:unhideWhenUsed="0"/>
-    <w:lsdException w:name="Colorful Shading Accent 1" w:semiHidden="0" w:uiPriority="71" w:unhideWhenUsed="0"/>
-    <w:lsdException w:name="Colorful List Accent 1" w:semiHidden="0" w:uiPriority="72" w:unhideWhenUsed="0"/>
-    <w:lsdException w:name="Colorful Grid Accent 1" w:semiHidden="0" w:uiPriority="73" w:unhideWhenUsed="0"/>
-    <w:lsdException w:name="Light Shading Accent 2" w:semiHidden="0" w:uiPriority="60" w:unhideWhenUsed="0"/>
-    <w:lsdException w:name="Light List Accent 2" w:semiHidden="0" w:uiPriority="61" w:unhideWhenUsed="0"/>
-    <w:lsdException w:name="Light Grid Accent 2" w:semiHidden="0" w:uiPriority="62" w:unhideWhenUsed="0"/>
-    <w:lsdException w:name="Medium Shading 1 Accent 2" w:semiHidden="0" w:uiPriority="63" w:unhideWhenUsed="0"/>
-    <w:lsdException w:name="Medium Shading 2 Accent 2" w:semiHidden="0" w:uiPriority="64" w:unhideWhenUsed="0"/>
-    <w:lsdException w:name="Medium List 1 Accent 2" w:semiHidden="0" w:uiPriority="65" w:unhideWhenUsed="0"/>
-    <w:lsdException w:name="Medium List 2 Accent 2" w:semiHidden="0" w:uiPriority="66" w:unhideWhenUsed="0"/>
-    <w:lsdException w:name="Medium Grid 1 Accent 2" w:semiHidden="0" w:uiPriority="67" w:unhideWhenUsed="0"/>
-    <w:lsdException w:name="Medium Grid 2 Accent 2" w:semiHidden="0" w:uiPriority="68" w:unhideWhenUsed="0"/>
-    <w:lsdException w:name="Medium Grid 3 Accent 2" w:semiHidden="0" w:uiPriority="69" w:unhideWhenUsed="0"/>
-    <w:lsdException w:name="Dark List Accent 2" w:semiHidden="0" w:uiPriority="70" w:unhideWhenUsed="0"/>
-    <w:lsdException w:name="Colorful Shading Accent 2" w:semiHidden="0" w:uiPriority="71" w:unhideWhenUsed="0"/>
-    <w:lsdException w:name="Colorful List Accent 2" w:semiHidden="0" w:uiPriority="72" w:unhideWhenUsed="0"/>
-    <w:lsdException w:name="Colorful Grid Accent 2" w:semiHidden="0" w:uiPriority="73" w:unhideWhenUsed="0"/>
-    <w:lsdException w:name="Light Shading Accent 3" w:semiHidden="0" w:uiPriority="60" w:unhideWhenUsed="0"/>
-    <w:lsdException w:name="Light List Accent 3" w:semiHidden="0" w:uiPriority="61" w:unhideWhenUsed="0"/>
-    <w:lsdException w:name="Light Grid Accent 3" w:semiHidden="0" w:uiPriority="62" w:unhideWhenUsed="0"/>
-    <w:lsdException w:name="Medium Shading 1 Accent 3" w:semiHidden="0" w:uiPriority="63" w:unhideWhenUsed="0"/>
-    <w:lsdException w:name="Medium Shading 2 Accent 3" w:semiHidden="0" w:uiPriority="64" w:unhideWhenUsed="0"/>
-    <w:lsdException w:name="Medium List 1 Accent 3" w:semiHidden="0" w:uiPriority="65" w:unhideWhenUsed="0"/>
-    <w:lsdException w:name="Medium List 2 Accent 3" w:semiHidden="0" w:uiPriority="66" w:unhideWhenUsed="0"/>
-    <w:lsdException w:name="Medium Grid 1 Accent 3" w:semiHidden="0" w:uiPriority="67" w:unhideWhenUsed="0"/>
-    <w:lsdException w:name="Medium Grid 2 Accent 3" w:semiHidden="0" w:uiPriority="68" w:unhideWhenUsed="0"/>
-    <w:lsdException w:name="Medium Grid 3 Accent 3" w:semiHidden="0" w:uiPriority="69" w:unhideWhenUsed="0"/>
-    <w:lsdException w:name="Dark List Accent 3" w:semiHidden="0" w:uiPriority="70" w:unhideWhenUsed="0"/>
-    <w:lsdException w:name="Colorful Shading Accent 3" w:semiHidden="0" w:uiPriority="71" w:unhideWhenUsed="0"/>
-    <w:lsdException w:name="Colorful List Accent 3" w:semiHidden="0" w:uiPriority="72" w:unhideWhenUsed="0"/>
-    <w:lsdException w:name="Colorful Grid Accent 3" w:semiHidden="0" w:uiPriority="73" w:unhideWhenUsed="0"/>
-    <w:lsdException w:name="Light Shading Accent 4" w:semiHidden="0" w:uiPriority="60" w:unhideWhenUsed="0"/>
-    <w:lsdException w:name="Light List Accent 4" w:semiHidden="0" w:uiPriority="61" w:unhideWhenUsed="0"/>
-    <w:lsdException w:name="Light Grid Accent 4" w:semiHidden="0" w:uiPriority="62" w:unhideWhenUsed="0"/>
-    <w:lsdException w:name="Medium Shading 1 Accent 4" w:semiHidden="0" w:uiPriority="63" w:unhideWhenUsed="0"/>
-    <w:lsdException w:name="Medium Shading 2 Accent 4" w:semiHidden="0" w:uiPriority="64" w:unhideWhenUsed="0"/>
-    <w:lsdException w:name="Medium List 1 Accent 4" w:semiHidden="0" w:uiPriority="65" w:unhideWhenUsed="0"/>
-    <w:lsdException w:name="Medium List 2 Accent 4" w:semiHidden="0" w:uiPriority="66" w:unhideWhenUsed="0"/>
-    <w:lsdException w:name="Medium Grid 1 Accent 4" w:semiHidden="0" w:uiPriority="67" w:unhideWhenUsed="0"/>
-    <w:lsdException w:name="Medium Grid 2 Accent 4" w:semiHidden="0" w:uiPriority="68" w:unhideWhenUsed="0"/>
-    <w:lsdException w:name="Medium Grid 3 Accent 4" w:semiHidden="0" w:uiPriority="69" w:unhideWhenUsed="0"/>
-    <w:lsdException w:name="Dark List Accent 4" w:semiHidden="0" w:uiPriority="70" w:unhideWhenUsed="0"/>
-    <w:lsdException w:name="Colorful Shading Accent 4" w:semiHidden="0" w:uiPriority="71" w:unhideWhenUsed="0"/>
-    <w:lsdException w:name="Colorful List Accent 4" w:semiHidden="0" w:uiPriority="72" w:unhideWhenUsed="0"/>
-    <w:lsdException w:name="Colorful Grid Accent 4" w:semiHidden="0" w:uiPriority="73" w:unhideWhenUsed="0"/>
-    <w:lsdException w:name="Light Shading Accent 5" w:semiHidden="0" w:uiPriority="60" w:unhideWhenUsed="0"/>
-    <w:lsdException w:name="Light List Accent 5" w:semiHidden="0" w:uiPriority="61" w:unhideWhenUsed="0"/>
-    <w:lsdException w:name="Light Grid Accent 5" w:semiHidden="0" w:uiPriority="62" w:unhideWhenUsed="0"/>
-    <w:lsdException w:name="Medium Shading 1 Accent 5" w:semiHidden="0" w:uiPriority="63" w:unhideWhenUsed="0"/>
-    <w:lsdException w:name="Medium Shading 2 Accent 5" w:semiHidden="0" w:uiPriority="64" w:unhideWhenUsed="0"/>
-    <w:lsdException w:name="Medium List 1 Accent 5" w:semiHidden="0" w:uiPriority="65" w:unhideWhenUsed="0"/>
-    <w:lsdException w:name="Medium List 2 Accent 5" w:semiHidden="0" w:uiPriority="66" w:unhideWhenUsed="0"/>
-    <w:lsdException w:name="Medium Grid 1 Accent 5" w:semiHidden="0" w:uiPriority="67" w:unhideWhenUsed="0"/>
-    <w:lsdException w:name="Medium Grid 2 Accent 5" w:semiHidden="0" w:uiPriority="68" w:unhideWhenUsed="0"/>
-    <w:lsdException w:name="Medium Grid 3 Accent 5" w:semiHidden="0" w:uiPriority="69" w:unhideWhenUsed="0"/>
-    <w:lsdException w:name="Dark List Accent 5" w:semiHidden="0" w:uiPriority="70" w:unhideWhenUsed="0"/>
-    <w:lsdException w:name="Colorful Shading Accent 5" w:semiHidden="0" w:uiPriority="71" w:unhideWhenUsed="0"/>
-    <w:lsdException w:name="Colorful List Accent 5" w:semiHidden="0" w:uiPriority="72" w:unhideWhenUsed="0"/>
-    <w:lsdException w:name="Colorful Grid Accent 5" w:semiHidden="0" w:uiPriority="73" w:unhideWhenUsed="0"/>
-    <w:lsdException w:name="Light Shading Accent 6" w:semiHidden="0" w:uiPriority="60" w:unhideWhenUsed="0"/>
-    <w:lsdException w:name="Light List Accent 6" w:semiHidden="0" w:uiPriority="61" w:unhideWhenUsed="0"/>
-    <w:lsdException w:name="Light Grid Accent 6" w:semiHidden="0" w:uiPriority="62" w:unhideWhenUsed="0"/>
-    <w:lsdException w:name="Medium Shading 1 Accent 6" w:semiHidden="0" w:uiPriority="63" w:unhideWhenUsed="0"/>
-    <w:lsdException w:name="Medium Shading 2 Accent 6" w:semiHidden="0" w:uiPriority="64" w:unhideWhenUsed="0"/>
-    <w:lsdException w:name="Medium List 1 Accent 6" w:semiHidden="0" w:uiPriority="65" w:unhideWhenUsed="0"/>
-    <w:lsdException w:name="Medium List 2 Accent 6" w:semiHidden="0" w:uiPriority="66" w:unhideWhenUsed="0"/>
-    <w:lsdException w:name="Medium Grid 1 Accent 6" w:semiHidden="0" w:uiPriority="67" w:unhideWhenUsed="0"/>
-    <w:lsdException w:name="Medium Grid 2 Accent 6" w:semiHidden="0" w:uiPriority="68" w:unhideWhenUsed="0"/>
-    <w:lsdException w:name="Medium Grid 3 Accent 6" w:semiHidden="0" w:uiPriority="69" w:unhideWhenUsed="0"/>
-    <w:lsdException w:name="Dark List Accent 6" w:semiHidden="0" w:uiPriority="70" w:unhideWhenUsed="0"/>
-    <w:lsdException w:name="Colorful Shading Accent 6" w:semiHidden="0" w:uiPriority="71" w:unhideWhenUsed="0"/>
-    <w:lsdException w:name="Colorful List Accent 6" w:semiHidden="0" w:uiPriority="72" w:unhideWhenUsed="0"/>
-    <w:lsdException w:name="Colorful Grid Accent 6" w:semiHidden="0" w:uiPriority="73" w:unhideWhenUsed="0"/>
-    <w:lsdException w:name="Subtle Emphasis" w:semiHidden="0" w:uiPriority="19" w:unhideWhenUsed="0" w:qFormat="1"/>
-    <w:lsdException w:name="Intense Emphasis" w:semiHidden="0" w:uiPriority="21" w:unhideWhenUsed="0" w:qFormat="1"/>
-    <w:lsdException w:name="Subtle Reference" w:semiHidden="0" w:uiPriority="31" w:unhideWhenUsed="0" w:qFormat="1"/>
-    <w:lsdException w:name="Intense Reference" w:semiHidden="0" w:uiPriority="32" w:unhideWhenUsed="0" w:qFormat="1"/>
-    <w:lsdException w:name="Book Title" w:semiHidden="0" w:uiPriority="33" w:unhideWhenUsed="0" w:qFormat="1"/>
-    <w:lsdException w:name="Bibliography" w:uiPriority="37"/>
-    <w:lsdException w:name="TOC Heading" w:uiPriority="39" w:qFormat="1"/>
+  <w:latentStyles w:defLockedState="0" w:defUIPriority="99" w:defSemiHidden="0" w:defUnhideWhenUsed="0" w:defQFormat="0" w:count="376">
+    <w:lsdException w:name="Normal" w:uiPriority="0" w:qFormat="1"/>
+    <w:lsdException w:name="heading 1" w:uiPriority="9" w:qFormat="1"/>
+    <w:lsdException w:name="heading 2" w:semiHidden="1" w:uiPriority="9" w:unhideWhenUsed="1" w:qFormat="1"/>
+    <w:lsdException w:name="heading 3" w:semiHidden="1" w:uiPriority="9" w:unhideWhenUsed="1" w:qFormat="1"/>
+    <w:lsdException w:name="heading 4" w:semiHidden="1" w:uiPriority="9" w:unhideWhenUsed="1" w:qFormat="1"/>
+    <w:lsdException w:name="heading 5" w:semiHidden="1" w:uiPriority="9" w:unhideWhenUsed="1" w:qFormat="1"/>
+    <w:lsdException w:name="heading 6" w:semiHidden="1" w:uiPriority="9" w:unhideWhenUsed="1" w:qFormat="1"/>
+    <w:lsdException w:name="heading 7" w:semiHidden="1" w:uiPriority="9" w:unhideWhenUsed="1" w:qFormat="1"/>
+    <w:lsdException w:name="heading 8" w:semiHidden="1" w:uiPriority="9" w:unhideWhenUsed="1" w:qFormat="1"/>
+    <w:lsdException w:name="heading 9" w:semiHidden="1" w:uiPriority="9" w:unhideWhenUsed="1" w:qFormat="1"/>
+    <w:lsdException w:name="index 1" w:semiHidden="1" w:unhideWhenUsed="1"/>
+    <w:lsdException w:name="index 2" w:semiHidden="1" w:unhideWhenUsed="1"/>
+    <w:lsdException w:name="index 3" w:semiHidden="1" w:unhideWhenUsed="1"/>
+    <w:lsdException w:name="index 4" w:semiHidden="1" w:unhideWhenUsed="1"/>
+    <w:lsdException w:name="index 5" w:semiHidden="1" w:unhideWhenUsed="1"/>
+    <w:lsdException w:name="index 6" w:semiHidden="1" w:unhideWhenUsed="1"/>
+    <w:lsdException w:name="index 7" w:semiHidden="1" w:unhideWhenUsed="1"/>
+    <w:lsdException w:name="index 8" w:semiHidden="1" w:unhideWhenUsed="1"/>
+    <w:lsdException w:name="index 9" w:semiHidden="1" w:unhideWhenUsed="1"/>
+    <w:lsdException w:name="toc 1" w:semiHidden="1" w:uiPriority="39" w:unhideWhenUsed="1"/>
+    <w:lsdException w:name="toc 2" w:semiHidden="1" w:uiPriority="39" w:unhideWhenUsed="1"/>
+    <w:lsdException w:name="toc 3" w:semiHidden="1" w:uiPriority="39" w:unhideWhenUsed="1"/>
+    <w:lsdException w:name="toc 4" w:semiHidden="1" w:uiPriority="39" w:unhideWhenUsed="1"/>
+    <w:lsdException w:name="toc 5" w:semiHidden="1" w:uiPriority="39" w:unhideWhenUsed="1"/>
+    <w:lsdException w:name="toc 6" w:semiHidden="1" w:uiPriority="39" w:unhideWhenUsed="1"/>
+    <w:lsdException w:name="toc 7" w:semiHidden="1" w:uiPriority="39" w:unhideWhenUsed="1"/>
+    <w:lsdException w:name="toc 8" w:semiHidden="1" w:uiPriority="39" w:unhideWhenUsed="1"/>
+    <w:lsdException w:name="toc 9" w:semiHidden="1" w:uiPriority="39" w:unhideWhenUsed="1"/>
+    <w:lsdException w:name="Normal Indent" w:semiHidden="1" w:unhideWhenUsed="1"/>
+    <w:lsdException w:name="footnote text" w:semiHidden="1" w:unhideWhenUsed="1"/>
+    <w:lsdException w:name="annotation text" w:semiHidden="1" w:unhideWhenUsed="1"/>
+    <w:lsdException w:name="header" w:semiHidden="1" w:unhideWhenUsed="1"/>
+    <w:lsdException w:name="footer" w:semiHidden="1" w:unhideWhenUsed="1"/>
+    <w:lsdException w:name="index heading" w:semiHidden="1" w:unhideWhenUsed="1"/>
+    <w:lsdException w:name="caption" w:semiHidden="1" w:uiPriority="35" w:unhideWhenUsed="1" w:qFormat="1"/>
+    <w:lsdException w:name="table of figures" w:semiHidden="1" w:unhideWhenUsed="1"/>
+    <w:lsdException w:name="envelope address" w:semiHidden="1" w:unhideWhenUsed="1"/>
+    <w:lsdException w:name="envelope return" w:semiHidden="1" w:unhideWhenUsed="1"/>
+    <w:lsdException w:name="footnote reference" w:semiHidden="1" w:unhideWhenUsed="1"/>
+    <w:lsdException w:name="annotation reference" w:semiHidden="1" w:unhideWhenUsed="1"/>
+    <w:lsdException w:name="line number" w:semiHidden="1" w:unhideWhenUsed="1"/>
+    <w:lsdException w:name="page number" w:semiHidden="1" w:unhideWhenUsed="1"/>
+    <w:lsdException w:name="endnote reference" w:semiHidden="1" w:unhideWhenUsed="1"/>
+    <w:lsdException w:name="endnote text" w:semiHidden="1" w:unhideWhenUsed="1"/>
+    <w:lsdException w:name="table of authorities" w:semiHidden="1" w:unhideWhenUsed="1"/>
+    <w:lsdException w:name="macro" w:semiHidden="1" w:unhideWhenUsed="1"/>
+    <w:lsdException w:name="toa heading" w:semiHidden="1" w:unhideWhenUsed="1"/>
+    <w:lsdException w:name="List" w:semiHidden="1" w:unhideWhenUsed="1"/>
+    <w:lsdException w:name="List Bullet" w:semiHidden="1" w:unhideWhenUsed="1"/>
+    <w:lsdException w:name="List Number" w:semiHidden="1" w:unhideWhenUsed="1"/>
+    <w:lsdException w:name="List 2" w:semiHidden="1" w:unhideWhenUsed="1"/>
+    <w:lsdException w:name="List 3" w:semiHidden="1" w:unhideWhenUsed="1"/>
+    <w:lsdException w:name="List 4" w:semiHidden="1" w:unhideWhenUsed="1"/>
+    <w:lsdException w:name="List 5" w:semiHidden="1" w:unhideWhenUsed="1"/>
+    <w:lsdException w:name="List Bullet 2" w:semiHidden="1" w:unhideWhenUsed="1"/>
+    <w:lsdException w:name="List Bullet 3" w:semiHidden="1" w:unhideWhenUsed="1"/>
+    <w:lsdException w:name="List Bullet 4" w:semiHidden="1" w:unhideWhenUsed="1"/>
+    <w:lsdException w:name="List Bullet 5" w:semiHidden="1" w:unhideWhenUsed="1"/>
+    <w:lsdException w:name="List Number 2" w:semiHidden="1" w:unhideWhenUsed="1"/>
+    <w:lsdException w:name="List Number 3" w:semiHidden="1" w:unhideWhenUsed="1"/>
+    <w:lsdException w:name="List Number 4" w:semiHidden="1" w:unhideWhenUsed="1"/>
+    <w:lsdException w:name="List Number 5" w:semiHidden="1" w:unhideWhenUsed="1"/>
+    <w:lsdException w:name="Title" w:uiPriority="10" w:qFormat="1"/>
+    <w:lsdException w:name="Closing" w:semiHidden="1" w:unhideWhenUsed="1"/>
+    <w:lsdException w:name="Signature" w:semiHidden="1" w:unhideWhenUsed="1"/>
+    <w:lsdException w:name="Default Paragraph Font" w:semiHidden="1" w:uiPriority="1" w:unhideWhenUsed="1"/>
+    <w:lsdException w:name="Body Text" w:semiHidden="1" w:unhideWhenUsed="1"/>
+    <w:lsdException w:name="Body Text Indent" w:semiHidden="1" w:unhideWhenUsed="1"/>
+    <w:lsdException w:name="List Continue" w:semiHidden="1" w:unhideWhenUsed="1"/>
+    <w:lsdException w:name="List Continue 2" w:semiHidden="1" w:unhideWhenUsed="1"/>
+    <w:lsdException w:name="List Continue 3" w:semiHidden="1" w:unhideWhenUsed="1"/>
+    <w:lsdException w:name="List Continue 4" w:semiHidden="1" w:unhideWhenUsed="1"/>
+    <w:lsdException w:name="List Continue 5" w:semiHidden="1" w:unhideWhenUsed="1"/>
+    <w:lsdException w:name="Message Header" w:semiHidden="1" w:unhideWhenUsed="1"/>
+    <w:lsdException w:name="Subtitle" w:uiPriority="11" w:qFormat="1"/>
+    <w:lsdException w:name="Salutation" w:semiHidden="1" w:unhideWhenUsed="1"/>
+    <w:lsdException w:name="Date" w:semiHidden="1" w:unhideWhenUsed="1"/>
+    <w:lsdException w:name="Body Text First Indent" w:semiHidden="1" w:unhideWhenUsed="1"/>
+    <w:lsdException w:name="Body Text First Indent 2" w:semiHidden="1" w:unhideWhenUsed="1"/>
+    <w:lsdException w:name="Note Heading" w:semiHidden="1" w:unhideWhenUsed="1"/>
+    <w:lsdException w:name="Body Text 2" w:semiHidden="1" w:unhideWhenUsed="1"/>
+    <w:lsdException w:name="Body Text 3" w:semiHidden="1" w:unhideWhenUsed="1"/>
+    <w:lsdException w:name="Body Text Indent 2" w:semiHidden="1" w:unhideWhenUsed="1"/>
+    <w:lsdException w:name="Body Text Indent 3" w:semiHidden="1" w:unhideWhenUsed="1"/>
+    <w:lsdException w:name="Block Text" w:semiHidden="1" w:unhideWhenUsed="1"/>
+    <w:lsdException w:name="Hyperlink" w:semiHidden="1" w:unhideWhenUsed="1"/>
+    <w:lsdException w:name="FollowedHyperlink" w:semiHidden="1" w:unhideWhenUsed="1"/>
+    <w:lsdException w:name="Strong" w:uiPriority="22" w:qFormat="1"/>
+    <w:lsdException w:name="Emphasis" w:uiPriority="20" w:qFormat="1"/>
+    <w:lsdException w:name="Document Map" w:semiHidden="1" w:unhideWhenUsed="1"/>
+    <w:lsdException w:name="Plain Text" w:semiHidden="1" w:unhideWhenUsed="1"/>
+    <w:lsdException w:name="E-mail Signature" w:semiHidden="1" w:unhideWhenUsed="1"/>
+    <w:lsdException w:name="HTML Top of Form" w:semiHidden="1" w:unhideWhenUsed="1"/>
+    <w:lsdException w:name="HTML Bottom of Form" w:semiHidden="1" w:unhideWhenUsed="1"/>
+    <w:lsdException w:name="Normal (Web)" w:semiHidden="1" w:unhideWhenUsed="1"/>
+    <w:lsdException w:name="HTML Acronym" w:semiHidden="1" w:unhideWhenUsed="1"/>
+    <w:lsdException w:name="HTML Address" w:semiHidden="1" w:unhideWhenUsed="1"/>
+    <w:lsdException w:name="HTML Cite" w:semiHidden="1" w:unhideWhenUsed="1"/>
+    <w:lsdException w:name="HTML Code" w:semiHidden="1" w:unhideWhenUsed="1"/>
+    <w:lsdException w:name="HTML Definition" w:semiHidden="1" w:unhideWhenUsed="1"/>
+    <w:lsdException w:name="HTML Keyboard" w:semiHidden="1" w:unhideWhenUsed="1"/>
+    <w:lsdException w:name="HTML Preformatted" w:semiHidden="1" w:unhideWhenUsed="1"/>
+    <w:lsdException w:name="HTML Sample" w:semiHidden="1" w:unhideWhenUsed="1"/>
+    <w:lsdException w:name="HTML Typewriter" w:semiHidden="1" w:unhideWhenUsed="1"/>
+    <w:lsdException w:name="HTML Variable" w:semiHidden="1" w:unhideWhenUsed="1"/>
+    <w:lsdException w:name="Normal Table" w:semiHidden="1" w:unhideWhenUsed="1"/>
+    <w:lsdException w:name="annotation subject" w:semiHidden="1" w:unhideWhenUsed="1"/>
+    <w:lsdException w:name="No List" w:semiHidden="1" w:unhideWhenUsed="1"/>
+    <w:lsdException w:name="Outline List 1" w:semiHidden="1" w:unhideWhenUsed="1"/>
+    <w:lsdException w:name="Outline List 2" w:semiHidden="1" w:unhideWhenUsed="1"/>
+    <w:lsdException w:name="Outline List 3" w:semiHidden="1" w:unhideWhenUsed="1"/>
+    <w:lsdException w:name="Table Simple 1" w:semiHidden="1" w:unhideWhenUsed="1"/>
+    <w:lsdException w:name="Table Simple 2" w:semiHidden="1" w:unhideWhenUsed="1"/>
+    <w:lsdException w:name="Table Simple 3" w:semiHidden="1" w:unhideWhenUsed="1"/>
+    <w:lsdException w:name="Table Classic 1" w:semiHidden="1" w:unhideWhenUsed="1"/>
+    <w:lsdException w:name="Table Classic 2" w:semiHidden="1" w:unhideWhenUsed="1"/>
+    <w:lsdException w:name="Table Classic 3" w:semiHidden="1" w:unhideWhenUsed="1"/>
+    <w:lsdException w:name="Table Classic 4" w:semiHidden="1" w:unhideWhenUsed="1"/>
+    <w:lsdException w:name="Table Colorful 1" w:semiHidden="1" w:unhideWhenUsed="1"/>
+    <w:lsdException w:name="Table Colorful 2" w:semiHidden="1" w:unhideWhenUsed="1"/>
+    <w:lsdException w:name="Table Colorful 3" w:semiHidden="1" w:unhideWhenUsed="1"/>
+    <w:lsdException w:name="Table Columns 1" w:semiHidden="1" w:unhideWhenUsed="1"/>
+    <w:lsdException w:name="Table Columns 2" w:semiHidden="1" w:unhideWhenUsed="1"/>
+    <w:lsdException w:name="Table Columns 3" w:semiHidden="1" w:unhideWhenUsed="1"/>
+    <w:lsdException w:name="Table Columns 4" w:semiHidden="1" w:unhideWhenUsed="1"/>
+    <w:lsdException w:name="Table Columns 5" w:semiHidden="1" w:unhideWhenUsed="1"/>
+    <w:lsdException w:name="Table Grid 1" w:semiHidden="1" w:unhideWhenUsed="1"/>
+    <w:lsdException w:name="Table Grid 2" w:semiHidden="1" w:unhideWhenUsed="1"/>
+    <w:lsdException w:name="Table Grid 3" w:semiHidden="1" w:unhideWhenUsed="1"/>
+    <w:lsdException w:name="Table Grid 4" w:semiHidden="1" w:unhideWhenUsed="1"/>
+    <w:lsdException w:name="Table Grid 5" w:semiHidden="1" w:unhideWhenUsed="1"/>
+    <w:lsdException w:name="Table Grid 6" w:semiHidden="1" w:unhideWhenUsed="1"/>
+    <w:lsdException w:name="Table Grid 7" w:semiHidden="1" w:unhideWhenUsed="1"/>
+    <w:lsdException w:name="Table Grid 8" w:semiHidden="1" w:unhideWhenUsed="1"/>
+    <w:lsdException w:name="Table List 1" w:semiHidden="1" w:unhideWhenUsed="1"/>
+    <w:lsdException w:name="Table List 2" w:semiHidden="1" w:unhideWhenUsed="1"/>
+    <w:lsdException w:name="Table List 3" w:semiHidden="1" w:unhideWhenUsed="1"/>
+    <w:lsdException w:name="Table List 4" w:semiHidden="1" w:unhideWhenUsed="1"/>
+    <w:lsdException w:name="Table List 5" w:semiHidden="1" w:unhideWhenUsed="1"/>
+    <w:lsdException w:name="Table List 6" w:semiHidden="1" w:unhideWhenUsed="1"/>
+    <w:lsdException w:name="Table List 7" w:semiHidden="1" w:unhideWhenUsed="1"/>
+    <w:lsdException w:name="Table List 8" w:semiHidden="1" w:unhideWhenUsed="1"/>
+    <w:lsdException w:name="Table 3D effects 1" w:semiHidden="1" w:unhideWhenUsed="1"/>
+    <w:lsdException w:name="Table 3D effects 2" w:semiHidden="1" w:unhideWhenUsed="1"/>
+    <w:lsdException w:name="Table 3D effects 3" w:semiHidden="1" w:unhideWhenUsed="1"/>
+    <w:lsdException w:name="Table Contemporary" w:semiHidden="1" w:unhideWhenUsed="1"/>
+    <w:lsdException w:name="Table Elegant" w:semiHidden="1" w:unhideWhenUsed="1"/>
+    <w:lsdException w:name="Table Professional" w:semiHidden="1" w:unhideWhenUsed="1"/>
+    <w:lsdException w:name="Table Subtle 1" w:semiHidden="1" w:unhideWhenUsed="1"/>
+    <w:lsdException w:name="Table Subtle 2" w:semiHidden="1" w:unhideWhenUsed="1"/>
+    <w:lsdException w:name="Table Web 1" w:semiHidden="1" w:unhideWhenUsed="1"/>
+    <w:lsdException w:name="Table Web 2" w:semiHidden="1" w:unhideWhenUsed="1"/>
+    <w:lsdException w:name="Table Web 3" w:semiHidden="1" w:unhideWhenUsed="1"/>
+    <w:lsdException w:name="Balloon Text" w:semiHidden="1" w:unhideWhenUsed="1"/>
+    <w:lsdException w:name="Table Grid" w:uiPriority="59"/>
+    <w:lsdException w:name="Table Theme" w:semiHidden="1" w:unhideWhenUsed="1"/>
+    <w:lsdException w:name="Placeholder Text" w:semiHidden="1"/>
+    <w:lsdException w:name="No Spacing" w:uiPriority="1" w:qFormat="1"/>
+    <w:lsdException w:name="Light Shading" w:uiPriority="60"/>
+    <w:lsdException w:name="Light List" w:uiPriority="61"/>
+    <w:lsdException w:name="Light Grid" w:uiPriority="62"/>
+    <w:lsdException w:name="Medium Shading 1" w:uiPriority="63"/>
+    <w:lsdException w:name="Medium Shading 2" w:uiPriority="64"/>
+    <w:lsdException w:name="Medium List 1" w:uiPriority="65"/>
+    <w:lsdException w:name="Medium List 2" w:uiPriority="66"/>
+    <w:lsdException w:name="Medium Grid 1" w:uiPriority="67"/>
+    <w:lsdException w:name="Medium Grid 2" w:uiPriority="68"/>
+    <w:lsdException w:name="Medium Grid 3" w:uiPriority="69"/>
+    <w:lsdException w:name="Dark List" w:uiPriority="70"/>
+    <w:lsdException w:name="Colorful Shading" w:uiPriority="71"/>
+    <w:lsdException w:name="Colorful List" w:uiPriority="72"/>
+    <w:lsdException w:name="Colorful Grid" w:uiPriority="73"/>
+    <w:lsdException w:name="Light Shading Accent 1" w:uiPriority="60"/>
+    <w:lsdException w:name="Light List Accent 1" w:uiPriority="61"/>
+    <w:lsdException w:name="Light Grid Accent 1" w:uiPriority="62"/>
+    <w:lsdException w:name="Medium Shading 1 Accent 1" w:uiPriority="63"/>
+    <w:lsdException w:name="Medium Shading 2 Accent 1" w:uiPriority="64"/>
+    <w:lsdException w:name="Medium List 1 Accent 1" w:uiPriority="65"/>
+    <w:lsdException w:name="Revision" w:semiHidden="1"/>
+    <w:lsdException w:name="List Paragraph" w:uiPriority="34" w:qFormat="1"/>
+    <w:lsdException w:name="Quote" w:uiPriority="29" w:qFormat="1"/>
+    <w:lsdException w:name="Intense Quote" w:uiPriority="30" w:qFormat="1"/>
+    <w:lsdException w:name="Medium List 2 Accent 1" w:uiPriority="66"/>
+    <w:lsdException w:name="Medium Grid 1 Accent 1" w:uiPriority="67"/>
+    <w:lsdException w:name="Medium Grid 2 Accent 1" w:uiPriority="68"/>
+    <w:lsdException w:name="Medium Grid 3 Accent 1" w:uiPriority="69"/>
+    <w:lsdException w:name="Dark List Accent 1" w:uiPriority="70"/>
+    <w:lsdException w:name="Colorful Shading Accent 1" w:uiPriority="71"/>
+    <w:lsdException w:name="Colorful List Accent 1" w:uiPriority="72"/>
+    <w:lsdException w:name="Colorful Grid Accent 1" w:uiPriority="73"/>
+    <w:lsdException w:name="Light Shading Accent 2" w:uiPriority="60"/>
+    <w:lsdException w:name="Light List Accent 2" w:uiPriority="61"/>
+    <w:lsdException w:name="Light Grid Accent 2" w:uiPriority="62"/>
+    <w:lsdException w:name="Medium Shading 1 Accent 2" w:uiPriority="63"/>
+    <w:lsdException w:name="Medium Shading 2 Accent 2" w:uiPriority="64"/>
+    <w:lsdException w:name="Medium List 1 Accent 2" w:uiPriority="65"/>
+    <w:lsdException w:name="Medium List 2 Accent 2" w:uiPriority="66"/>
+    <w:lsdException w:name="Medium Grid 1 Accent 2" w:uiPriority="67"/>
+    <w:lsdException w:name="Medium Grid 2 Accent 2" w:uiPriority="68"/>
+    <w:lsdException w:name="Medium Grid 3 Accent 2" w:uiPriority="69"/>
+    <w:lsdException w:name="Dark List Accent 2" w:uiPriority="70"/>
+    <w:lsdException w:name="Colorful Shading Accent 2" w:uiPriority="71"/>
+    <w:lsdException w:name="Colorful List Accent 2" w:uiPriority="72"/>
+    <w:lsdException w:name="Colorful Grid Accent 2" w:uiPriority="73"/>
+    <w:lsdException w:name="Light Shading Accent 3" w:uiPriority="60"/>
+    <w:lsdException w:name="Light List Accent 3" w:uiPriority="61"/>
+    <w:lsdException w:name="Light Grid Accent 3" w:uiPriority="62"/>
+    <w:lsdException w:name="Medium Shading 1 Accent 3" w:uiPriority="63"/>
+    <w:lsdException w:name="Medium Shading 2 Accent 3" w:uiPriority="64"/>
+    <w:lsdException w:name="Medium List 1 Accent 3" w:uiPriority="65"/>
+    <w:lsdException w:name="Medium List 2 Accent 3" w:uiPriority="66"/>
+    <w:lsdException w:name="Medium Grid 1 Accent 3" w:uiPriority="67"/>
+    <w:lsdException w:name="Medium Grid 2 Accent 3" w:uiPriority="68"/>
+    <w:lsdException w:name="Medium Grid 3 Accent 3" w:uiPriority="69"/>
+    <w:lsdException w:name="Dark List Accent 3" w:uiPriority="70"/>
+    <w:lsdException w:name="Colorful Shading Accent 3" w:uiPriority="71"/>
+    <w:lsdException w:name="Colorful List Accent 3" w:uiPriority="72"/>
+    <w:lsdException w:name="Colorful Grid Accent 3" w:uiPriority="73"/>
+    <w:lsdException w:name="Light Shading Accent 4" w:uiPriority="60"/>
+    <w:lsdException w:name="Light List Accent 4" w:uiPriority="61"/>
+    <w:lsdException w:name="Light Grid Accent 4" w:uiPriority="62"/>
+    <w:lsdException w:name="Medium Shading 1 Accent 4" w:uiPriority="63"/>
+    <w:lsdException w:name="Medium Shading 2 Accent 4" w:uiPriority="64"/>
+    <w:lsdException w:name="Medium List 1 Accent 4" w:uiPriority="65"/>
+    <w:lsdException w:name="Medium List 2 Accent 4" w:uiPriority="66"/>
+    <w:lsdException w:name="Medium Grid 1 Accent 4" w:uiPriority="67"/>
+    <w:lsdException w:name="Medium Grid 2 Accent 4" w:uiPriority="68"/>
+    <w:lsdException w:name="Medium Grid 3 Accent 4" w:uiPriority="69"/>
+    <w:lsdException w:name="Dark List Accent 4" w:uiPriority="70"/>
+    <w:lsdException w:name="Colorful Shading Accent 4" w:uiPriority="71"/>
+    <w:lsdException w:name="Colorful List Accent 4" w:uiPriority="72"/>
+    <w:lsdException w:name="Colorful Grid Accent 4" w:uiPriority="73"/>
+    <w:lsdException w:name="Light Shading Accent 5" w:uiPriority="60"/>
+    <w:lsdException w:name="Light List Accent 5" w:uiPriority="61"/>
+    <w:lsdException w:name="Light Grid Accent 5" w:uiPriority="62"/>
+    <w:lsdException w:name="Medium Shading 1 Accent 5" w:uiPriority="63"/>
+    <w:lsdException w:name="Medium Shading 2 Accent 5" w:uiPriority="64"/>
+    <w:lsdException w:name="Medium List 1 Accent 5" w:uiPriority="65"/>
+    <w:lsdException w:name="Medium List 2 Accent 5" w:uiPriority="66"/>
+    <w:lsdException w:name="Medium Grid 1 Accent 5" w:uiPriority="67"/>
+    <w:lsdException w:name="Medium Grid 2 Accent 5" w:uiPriority="68"/>
+    <w:lsdException w:name="Medium Grid 3 Accent 5" w:uiPriority="69"/>
+    <w:lsdException w:name="Dark List Accent 5" w:uiPriority="70"/>
+    <w:lsdException w:name="Colorful Shading Accent 5" w:uiPriority="71"/>
+    <w:lsdException w:name="Colorful List Accent 5" w:uiPriority="72"/>
+    <w:lsdException w:name="Colorful Grid Accent 5" w:uiPriority="73"/>
+    <w:lsdException w:name="Light Shading Accent 6" w:uiPriority="60"/>
+    <w:lsdException w:name="Light List Accent 6" w:uiPriority="61"/>
+    <w:lsdException w:name="Light Grid Accent 6" w:uiPriority="62"/>
+    <w:lsdException w:name="Medium Shading 1 Accent 6" w:uiPriority="63"/>
+    <w:lsdException w:name="Medium Shading 2 Accent 6" w:uiPriority="64"/>
+    <w:lsdException w:name="Medium List 1 Accent 6" w:uiPriority="65"/>
+    <w:lsdException w:name="Medium List 2 Accent 6" w:uiPriority="66"/>
+    <w:lsdException w:name="Medium Grid 1 Accent 6" w:uiPriority="67"/>
+    <w:lsdException w:name="Medium Grid 2 Accent 6" w:uiPriority="68"/>
+    <w:lsdException w:name="Medium Grid 3 Accent 6" w:uiPriority="69"/>
+    <w:lsdException w:name="Dark List Accent 6" w:uiPriority="70"/>
+    <w:lsdException w:name="Colorful Shading Accent 6" w:uiPriority="71"/>
+    <w:lsdException w:name="Colorful List Accent 6" w:uiPriority="72"/>
+    <w:lsdException w:name="Colorful Grid Accent 6" w:uiPriority="73"/>
+    <w:lsdException w:name="Subtle Emphasis" w:uiPriority="19" w:qFormat="1"/>
+    <w:lsdException w:name="Intense Emphasis" w:uiPriority="21" w:qFormat="1"/>
+    <w:lsdException w:name="Subtle Reference" w:uiPriority="31" w:qFormat="1"/>
+    <w:lsdException w:name="Intense Reference" w:uiPriority="32" w:qFormat="1"/>
+    <w:lsdException w:name="Book Title" w:uiPriority="33" w:qFormat="1"/>
+    <w:lsdException w:name="Bibliography" w:semiHidden="1" w:uiPriority="37" w:unhideWhenUsed="1"/>
+    <w:lsdException w:name="TOC Heading" w:semiHidden="1" w:uiPriority="39" w:unhideWhenUsed="1" w:qFormat="1"/>
+    <w:lsdException w:name="Plain Table 1" w:uiPriority="41"/>
+    <w:lsdException w:name="Plain Table 2" w:uiPriority="42"/>
+    <w:lsdException w:name="Plain Table 3" w:uiPriority="43"/>
+    <w:lsdException w:name="Plain Table 4" w:uiPriority="44"/>
+    <w:lsdException w:name="Plain Table 5" w:uiPriority="45"/>
+    <w:lsdException w:name="Grid Table Light" w:uiPriority="40"/>
+    <w:lsdException w:name="Grid Table 1 Light" w:uiPriority="46"/>
+    <w:lsdException w:name="Grid Table 2" w:uiPriority="47"/>
+    <w:lsdException w:name="Grid Table 3" w:uiPriority="48"/>
+    <w:lsdException w:name="Grid Table 4" w:uiPriority="49"/>
+    <w:lsdException w:name="Grid Table 5 Dark" w:uiPriority="50"/>
+    <w:lsdException w:name="Grid Table 6 Colorful" w:uiPriority="51"/>
+    <w:lsdException w:name="Grid Table 7 Colorful" w:uiPriority="52"/>
+    <w:lsdException w:name="Grid Table 1 Light Accent 1" w:uiPriority="46"/>
+    <w:lsdException w:name="Grid Table 2 Accent 1" w:uiPriority="47"/>
+    <w:lsdException w:name="Grid Table 3 Accent 1" w:uiPriority="48"/>
+    <w:lsdException w:name="Grid Table 4 Accent 1" w:uiPriority="49"/>
+    <w:lsdException w:name="Grid Table 5 Dark Accent 1" w:uiPriority="50"/>
+    <w:lsdException w:name="Grid Table 6 Colorful Accent 1" w:uiPriority="51"/>
+    <w:lsdException w:name="Grid Table 7 Colorful Accent 1" w:uiPriority="52"/>
+    <w:lsdException w:name="Grid Table 1 Light Accent 2" w:uiPriority="46"/>
+    <w:lsdException w:name="Grid Table 2 Accent 2" w:uiPriority="47"/>
+    <w:lsdException w:name="Grid Table 3 Accent 2" w:uiPriority="48"/>
+    <w:lsdException w:name="Grid Table 4 Accent 2" w:uiPriority="49"/>
+    <w:lsdException w:name="Grid Table 5 Dark Accent 2" w:uiPriority="50"/>
+    <w:lsdException w:name="Grid Table 6 Colorful Accent 2" w:uiPriority="51"/>
+    <w:lsdException w:name="Grid Table 7 Colorful Accent 2" w:uiPriority="52"/>
+    <w:lsdException w:name="Grid Table 1 Light Accent 3" w:uiPriority="46"/>
+    <w:lsdException w:name="Grid Table 2 Accent 3" w:uiPriority="47"/>
+    <w:lsdException w:name="Grid Table 3 Accent 3" w:uiPriority="48"/>
+    <w:lsdException w:name="Grid Table 4 Accent 3" w:uiPriority="49"/>
+    <w:lsdException w:name="Grid Table 5 Dark Accent 3" w:uiPriority="50"/>
+    <w:lsdException w:name="Grid Table 6 Colorful Accent 3" w:uiPriority="51"/>
+    <w:lsdException w:name="Grid Table 7 Colorful Accent 3" w:uiPriority="52"/>
+    <w:lsdException w:name="Grid Table 1 Light Accent 4" w:uiPriority="46"/>
+    <w:lsdException w:name="Grid Table 2 Accent 4" w:uiPriority="47"/>
+    <w:lsdException w:name="Grid Table 3 Accent 4" w:uiPriority="48"/>
+    <w:lsdException w:name="Grid Table 4 Accent 4" w:uiPriority="49"/>
+    <w:lsdException w:name="Grid Table 5 Dark Accent 4" w:uiPriority="50"/>
+    <w:lsdException w:name="Grid Table 6 Colorful Accent 4" w:uiPriority="51"/>
+    <w:lsdException w:name="Grid Table 7 Colorful Accent 4" w:uiPriority="52"/>
+    <w:lsdException w:name="Grid Table 1 Light Accent 5" w:uiPriority="46"/>
+    <w:lsdException w:name="Grid Table 2 Accent 5" w:uiPriority="47"/>
+    <w:lsdException w:name="Grid Table 3 Accent 5" w:uiPriority="48"/>
+    <w:lsdException w:name="Grid Table 4 Accent 5" w:uiPriority="49"/>
+    <w:lsdException w:name="Grid Table 5 Dark Accent 5" w:uiPriority="50"/>
+    <w:lsdException w:name="Grid Table 6 Colorful Accent 5" w:uiPriority="51"/>
+    <w:lsdException w:name="Grid Table 7 Colorful Accent 5" w:uiPriority="52"/>
+    <w:lsdException w:name="Grid Table 1 Light Accent 6" w:uiPriority="46"/>
+    <w:lsdException w:name="Grid Table 2 Accent 6" w:uiPriority="47"/>
+    <w:lsdException w:name="Grid Table 3 Accent 6" w:uiPriority="48"/>
+    <w:lsdException w:name="Grid Table 4 Accent 6" w:uiPriority="49"/>
+    <w:lsdException w:name="Grid Table 5 Dark Accent 6" w:uiPriority="50"/>
+    <w:lsdException w:name="Grid Table 6 Colorful Accent 6" w:uiPriority="51"/>
+    <w:lsdException w:name="Grid Table 7 Colorful Accent 6" w:uiPriority="52"/>
+    <w:lsdException w:name="List Table 1 Light" w:uiPriority="46"/>
+    <w:lsdException w:name="List Table 2" w:uiPriority="47"/>
+    <w:lsdException w:name="List Table 3" w:uiPriority="48"/>
+    <w:lsdException w:name="List Table 4" w:uiPriority="49"/>
+    <w:lsdException w:name="List Table 5 Dark" w:uiPriority="50"/>
+    <w:lsdException w:name="List Table 6 Colorful" w:uiPriority="51"/>
+    <w:lsdException w:name="List Table 7 Colorful" w:uiPriority="52"/>
+    <w:lsdException w:name="List Table 1 Light Accent 1" w:uiPriority="46"/>
+    <w:lsdException w:name="List Table 2 Accent 1" w:uiPriority="47"/>
+    <w:lsdException w:name="List Table 3 Accent 1" w:uiPriority="48"/>
+    <w:lsdException w:name="List Table 4 Accent 1" w:uiPriority="49"/>
+    <w:lsdException w:name="List Table 5 Dark Accent 1" w:uiPriority="50"/>
+    <w:lsdException w:name="List Table 6 Colorful Accent 1" w:uiPriority="51"/>
+    <w:lsdException w:name="List Table 7 Colorful Accent 1" w:uiPriority="52"/>
+    <w:lsdException w:name="List Table 1 Light Accent 2" w:uiPriority="46"/>
+    <w:lsdException w:name="List Table 2 Accent 2" w:uiPriority="47"/>
+    <w:lsdException w:name="List Table 3 Accent 2" w:uiPriority="48"/>
+    <w:lsdException w:name="List Table 4 Accent 2" w:uiPriority="49"/>
+    <w:lsdException w:name="List Table 5 Dark Accent 2" w:uiPriority="50"/>
+    <w:lsdException w:name="List Table 6 Colorful Accent 2" w:uiPriority="51"/>
+    <w:lsdException w:name="List Table 7 Colorful Accent 2" w:uiPriority="52"/>
+    <w:lsdException w:name="List Table 1 Light Accent 3" w:uiPriority="46"/>
+    <w:lsdException w:name="List Table 2 Accent 3" w:uiPriority="47"/>
+    <w:lsdException w:name="List Table 3 Accent 3" w:uiPriority="48"/>
+    <w:lsdException w:name="List Table 4 Accent 3" w:uiPriority="49"/>
+    <w:lsdException w:name="List Table 5 Dark Accent 3" w:uiPriority="50"/>
+    <w:lsdException w:name="List Table 6 Colorful Accent 3" w:uiPriority="51"/>
+    <w:lsdException w:name="List Table 7 Colorful Accent 3" w:uiPriority="52"/>
+    <w:lsdException w:name="List Table 1 Light Accent 4" w:uiPriority="46"/>
+    <w:lsdException w:name="List Table 2 Accent 4" w:uiPriority="47"/>
+    <w:lsdException w:name="List Table 3 Accent 4" w:uiPriority="48"/>
+    <w:lsdException w:name="List Table 4 Accent 4" w:uiPriority="49"/>
+    <w:lsdException w:name="List Table 5 Dark Accent 4" w:uiPriority="50"/>
+    <w:lsdException w:name="List Table 6 Colorful Accent 4" w:uiPriority="51"/>
+    <w:lsdException w:name="List Table 7 Colorful Accent 4" w:uiPriority="52"/>
+    <w:lsdException w:name="List Table 1 Light Accent 5" w:uiPriority="46"/>
+    <w:lsdException w:name="List Table 2 Accent 5" w:uiPriority="47"/>
+    <w:lsdException w:name="List Table 3 Accent 5" w:uiPriority="48"/>
+    <w:lsdException w:name="List Table 4 Accent 5" w:uiPriority="49"/>
+    <w:lsdException w:name="List Table 5 Dark Accent 5" w:uiPriority="50"/>
+    <w:lsdException w:name="List Table 6 Colorful Accent 5" w:uiPriority="51"/>
+    <w:lsdException w:name="List Table 7 Colorful Accent 5" w:uiPriority="52"/>
+    <w:lsdException w:name="List Table 1 Light Accent 6" w:uiPriority="46"/>
+    <w:lsdException w:name="List Table 2 Accent 6" w:uiPriority="47"/>
+    <w:lsdException w:name="List Table 3 Accent 6" w:uiPriority="48"/>
+    <w:lsdException w:name="List Table 4 Accent 6" w:uiPriority="49"/>
+    <w:lsdException w:name="List Table 5 Dark Accent 6" w:uiPriority="50"/>
+    <w:lsdException w:name="List Table 6 Colorful Accent 6" w:uiPriority="51"/>
+    <w:lsdException w:name="List Table 7 Colorful Accent 6" w:uiPriority="52"/>
+    <w:lsdException w:name="Mention" w:semiHidden="1" w:unhideWhenUsed="1"/>
+    <w:lsdException w:name="Smart Hyperlink" w:semiHidden="1" w:unhideWhenUsed="1"/>
+    <w:lsdException w:name="Hashtag" w:semiHidden="1" w:unhideWhenUsed="1"/>
+    <w:lsdException w:name="Unresolved Mention" w:semiHidden="1" w:unhideWhenUsed="1"/>
+    <w:lsdException w:name="Smart Link" w:semiHidden="1" w:unhideWhenUsed="1"/>
   </w:latentStyles>
   <w:style w:type="paragraph" w:default="1" w:styleId="Normal">
     <w:name w:val="Normal"/>
@@ -2100,7 +2294,6 @@
   <w:style w:type="character" w:default="1" w:styleId="DefaultParagraphFont">
     <w:name w:val="Default Paragraph Font"/>
     <w:uiPriority w:val="1"/>
-    <w:semiHidden/>
     <w:unhideWhenUsed/>
   </w:style>
   <w:style w:type="table" w:default="1" w:styleId="TableNormal">
@@ -2178,21 +2371,7 @@
       <w:szCs w:val="20"/>
       <w:lang w:val="en-US" w:eastAsia="en-AU"/>
     </w:rPr>
-    <w:tblPr>
-      <w:tblStyleRowBandSize w:val="1"/>
-      <w:tblStyleColBandSize w:val="1"/>
-      <w:tblInd w:w="0" w:type="dxa"/>
-      <w:tblBorders>
-        <w:top w:val="single" w:sz="8" w:space="0" w:color="000000" w:themeColor="text1"/>
-        <w:bottom w:val="single" w:sz="8" w:space="0" w:color="000000" w:themeColor="text1"/>
-      </w:tblBorders>
-      <w:tblCellMar>
-        <w:top w:w="0" w:type="dxa"/>
-        <w:left w:w="108" w:type="dxa"/>
-        <w:bottom w:w="0" w:type="dxa"/>
-        <w:right w:w="108" w:type="dxa"/>
-      </w:tblCellMar>
-    </w:tblPr>
+    <w:tblPr/>
     <w:tblStylePr w:type="firstRow">
       <w:pPr>
         <w:spacing w:before="0" w:after="0" w:line="240" w:lineRule="auto"/>
@@ -2284,17 +2463,10 @@
     <w:tblPr>
       <w:tblStyleRowBandSize w:val="1"/>
       <w:tblStyleColBandSize w:val="1"/>
-      <w:tblInd w:w="0" w:type="dxa"/>
       <w:tblBorders>
         <w:top w:val="single" w:sz="8" w:space="0" w:color="000000" w:themeColor="text1"/>
         <w:bottom w:val="single" w:sz="8" w:space="0" w:color="000000" w:themeColor="text1"/>
       </w:tblBorders>
-      <w:tblCellMar>
-        <w:top w:w="0" w:type="dxa"/>
-        <w:left w:w="108" w:type="dxa"/>
-        <w:bottom w:w="0" w:type="dxa"/>
-        <w:right w:w="108" w:type="dxa"/>
-      </w:tblCellMar>
     </w:tblPr>
     <w:tblStylePr w:type="firstRow">
       <w:pPr>
@@ -2385,7 +2557,6 @@
       <w:lang w:val="en-US"/>
     </w:rPr>
     <w:tblPr>
-      <w:tblInd w:w="0" w:type="dxa"/>
       <w:tblBorders>
         <w:top w:val="single" w:sz="4" w:space="0" w:color="auto"/>
         <w:left w:val="single" w:sz="4" w:space="0" w:color="auto"/>
@@ -2394,12 +2565,6 @@
         <w:insideH w:val="single" w:sz="4" w:space="0" w:color="auto"/>
         <w:insideV w:val="single" w:sz="4" w:space="0" w:color="auto"/>
       </w:tblBorders>
-      <w:tblCellMar>
-        <w:top w:w="0" w:type="dxa"/>
-        <w:left w:w="108" w:type="dxa"/>
-        <w:bottom w:w="0" w:type="dxa"/>
-        <w:right w:w="108" w:type="dxa"/>
-      </w:tblCellMar>
     </w:tblPr>
     <w:tcPr>
       <w:shd w:val="clear" w:color="auto" w:fill="FFFF99"/>
@@ -2421,7 +2586,6 @@
     </w:pPr>
     <w:tblPr>
       <w:jc w:val="center"/>
-      <w:tblInd w:w="0" w:type="dxa"/>
       <w:tblBorders>
         <w:top w:val="single" w:sz="4" w:space="0" w:color="auto"/>
         <w:left w:val="single" w:sz="4" w:space="0" w:color="auto"/>
@@ -2430,12 +2594,6 @@
         <w:insideH w:val="single" w:sz="4" w:space="0" w:color="auto"/>
         <w:insideV w:val="single" w:sz="4" w:space="0" w:color="auto"/>
       </w:tblBorders>
-      <w:tblCellMar>
-        <w:top w:w="0" w:type="dxa"/>
-        <w:left w:w="108" w:type="dxa"/>
-        <w:bottom w:w="0" w:type="dxa"/>
-        <w:right w:w="108" w:type="dxa"/>
-      </w:tblCellMar>
     </w:tblPr>
     <w:trPr>
       <w:jc w:val="center"/>
@@ -3001,1142 +3159,45 @@
       <w:lang w:eastAsia="en-AU"/>
     </w:rPr>
   </w:style>
-</w:styles>
-</file>
-
-<file path=word/stylesWithEffects.xml><?xml version="1.0" encoding="utf-8"?>
-<w:styles xmlns:wpc="http://schemas.microsoft.com/office/word/2010/wordprocessingCanvas" xmlns:mc="http://schemas.openxmlformats.org/markup-compatibility/2006" xmlns:o="urn:schemas-microsoft-com:office:office" xmlns:r="http://schemas.openxmlformats.org/officeDocument/2006/relationships" xmlns:m="http://schemas.openxmlformats.org/officeDocument/2006/math" xmlns:v="urn:schemas-microsoft-com:vml" xmlns:wp14="http://schemas.microsoft.com/office/word/2010/wordprocessingDrawing" xmlns:wp="http://schemas.openxmlformats.org/drawingml/2006/wordprocessingDrawing" xmlns:w10="urn:schemas-microsoft-com:office:word" xmlns:w="http://schemas.openxmlformats.org/wordprocessingml/2006/main" xmlns:w14="http://schemas.microsoft.com/office/word/2010/wordml" xmlns:wpg="http://schemas.microsoft.com/office/word/2010/wordprocessingGroup" xmlns:wpi="http://schemas.microsoft.com/office/word/2010/wordprocessingInk" xmlns:wne="http://schemas.microsoft.com/office/word/2006/wordml" xmlns:wps="http://schemas.microsoft.com/office/word/2010/wordprocessingShape" mc:Ignorable="w14 wp14">
-  <w:docDefaults>
-    <w:rPrDefault>
-      <w:rPr>
-        <w:rFonts w:asciiTheme="minorHAnsi" w:eastAsiaTheme="minorHAnsi" w:hAnsiTheme="minorHAnsi" w:cstheme="minorBidi"/>
-        <w:sz w:val="22"/>
-        <w:szCs w:val="22"/>
-        <w:lang w:val="en-AU" w:eastAsia="en-US" w:bidi="ar-SA"/>
-      </w:rPr>
-    </w:rPrDefault>
-    <w:pPrDefault>
-      <w:pPr>
-        <w:spacing w:after="200" w:line="276" w:lineRule="auto"/>
-      </w:pPr>
-    </w:pPrDefault>
-  </w:docDefaults>
-  <w:latentStyles w:defLockedState="0" w:defUIPriority="99" w:defSemiHidden="1" w:defUnhideWhenUsed="1" w:defQFormat="0" w:count="267">
-    <w:lsdException w:name="Normal" w:semiHidden="0" w:uiPriority="0" w:unhideWhenUsed="0" w:qFormat="1"/>
-    <w:lsdException w:name="heading 1" w:semiHidden="0" w:uiPriority="9" w:unhideWhenUsed="0" w:qFormat="1"/>
-    <w:lsdException w:name="heading 2" w:uiPriority="9" w:qFormat="1"/>
-    <w:lsdException w:name="heading 3" w:uiPriority="9" w:qFormat="1"/>
-    <w:lsdException w:name="heading 4" w:uiPriority="9" w:qFormat="1"/>
-    <w:lsdException w:name="heading 5" w:uiPriority="9" w:qFormat="1"/>
-    <w:lsdException w:name="heading 6" w:uiPriority="9" w:qFormat="1"/>
-    <w:lsdException w:name="heading 7" w:uiPriority="9" w:qFormat="1"/>
-    <w:lsdException w:name="heading 8" w:uiPriority="9" w:qFormat="1"/>
-    <w:lsdException w:name="heading 9" w:uiPriority="9" w:qFormat="1"/>
-    <w:lsdException w:name="toc 1" w:uiPriority="39"/>
-    <w:lsdException w:name="toc 2" w:uiPriority="39"/>
-    <w:lsdException w:name="toc 3" w:uiPriority="39"/>
-    <w:lsdException w:name="toc 4" w:uiPriority="39"/>
-    <w:lsdException w:name="toc 5" w:uiPriority="39"/>
-    <w:lsdException w:name="toc 6" w:uiPriority="39"/>
-    <w:lsdException w:name="toc 7" w:uiPriority="39"/>
-    <w:lsdException w:name="toc 8" w:uiPriority="39"/>
-    <w:lsdException w:name="toc 9" w:uiPriority="39"/>
-    <w:lsdException w:name="caption" w:uiPriority="35" w:qFormat="1"/>
-    <w:lsdException w:name="Title" w:semiHidden="0" w:uiPriority="10" w:unhideWhenUsed="0" w:qFormat="1"/>
-    <w:lsdException w:name="Default Paragraph Font" w:uiPriority="1"/>
-    <w:lsdException w:name="Subtitle" w:semiHidden="0" w:uiPriority="11" w:unhideWhenUsed="0" w:qFormat="1"/>
-    <w:lsdException w:name="Strong" w:semiHidden="0" w:uiPriority="22" w:unhideWhenUsed="0" w:qFormat="1"/>
-    <w:lsdException w:name="Emphasis" w:semiHidden="0" w:uiPriority="20" w:unhideWhenUsed="0" w:qFormat="1"/>
-    <w:lsdException w:name="Table Grid" w:semiHidden="0" w:uiPriority="59" w:unhideWhenUsed="0"/>
-    <w:lsdException w:name="Placeholder Text" w:unhideWhenUsed="0"/>
-    <w:lsdException w:name="No Spacing" w:semiHidden="0" w:uiPriority="1" w:unhideWhenUsed="0" w:qFormat="1"/>
-    <w:lsdException w:name="Light Shading" w:semiHidden="0" w:uiPriority="60" w:unhideWhenUsed="0"/>
-    <w:lsdException w:name="Light List" w:semiHidden="0" w:uiPriority="61" w:unhideWhenUsed="0"/>
-    <w:lsdException w:name="Light Grid" w:semiHidden="0" w:uiPriority="62" w:unhideWhenUsed="0"/>
-    <w:lsdException w:name="Medium Shading 1" w:semiHidden="0" w:uiPriority="63" w:unhideWhenUsed="0"/>
-    <w:lsdException w:name="Medium Shading 2" w:semiHidden="0" w:uiPriority="64" w:unhideWhenUsed="0"/>
-    <w:lsdException w:name="Medium List 1" w:semiHidden="0" w:uiPriority="65" w:unhideWhenUsed="0"/>
-    <w:lsdException w:name="Medium List 2" w:semiHidden="0" w:uiPriority="66" w:unhideWhenUsed="0"/>
-    <w:lsdException w:name="Medium Grid 1" w:semiHidden="0" w:uiPriority="67" w:unhideWhenUsed="0"/>
-    <w:lsdException w:name="Medium Grid 2" w:semiHidden="0" w:uiPriority="68" w:unhideWhenUsed="0"/>
-    <w:lsdException w:name="Medium Grid 3" w:semiHidden="0" w:uiPriority="69" w:unhideWhenUsed="0"/>
-    <w:lsdException w:name="Dark List" w:semiHidden="0" w:uiPriority="70" w:unhideWhenUsed="0"/>
-    <w:lsdException w:name="Colorful Shading" w:semiHidden="0" w:uiPriority="71" w:unhideWhenUsed="0"/>
-    <w:lsdException w:name="Colorful List" w:semiHidden="0" w:uiPriority="72" w:unhideWhenUsed="0"/>
-    <w:lsdException w:name="Colorful Grid" w:semiHidden="0" w:uiPriority="73" w:unhideWhenUsed="0"/>
-    <w:lsdException w:name="Light Shading Accent 1" w:semiHidden="0" w:uiPriority="60" w:unhideWhenUsed="0"/>
-    <w:lsdException w:name="Light List Accent 1" w:semiHidden="0" w:uiPriority="61" w:unhideWhenUsed="0"/>
-    <w:lsdException w:name="Light Grid Accent 1" w:semiHidden="0" w:uiPriority="62" w:unhideWhenUsed="0"/>
-    <w:lsdException w:name="Medium Shading 1 Accent 1" w:semiHidden="0" w:uiPriority="63" w:unhideWhenUsed="0"/>
-    <w:lsdException w:name="Medium Shading 2 Accent 1" w:semiHidden="0" w:uiPriority="64" w:unhideWhenUsed="0"/>
-    <w:lsdException w:name="Medium List 1 Accent 1" w:semiHidden="0" w:uiPriority="65" w:unhideWhenUsed="0"/>
-    <w:lsdException w:name="Revision" w:unhideWhenUsed="0"/>
-    <w:lsdException w:name="List Paragraph" w:semiHidden="0" w:uiPriority="34" w:unhideWhenUsed="0" w:qFormat="1"/>
-    <w:lsdException w:name="Quote" w:semiHidden="0" w:uiPriority="29" w:unhideWhenUsed="0" w:qFormat="1"/>
-    <w:lsdException w:name="Intense Quote" w:semiHidden="0" w:uiPriority="30" w:unhideWhenUsed="0" w:qFormat="1"/>
-    <w:lsdException w:name="Medium List 2 Accent 1" w:semiHidden="0" w:uiPriority="66" w:unhideWhenUsed="0"/>
-    <w:lsdException w:name="Medium Grid 1 Accent 1" w:semiHidden="0" w:uiPriority="67" w:unhideWhenUsed="0"/>
-    <w:lsdException w:name="Medium Grid 2 Accent 1" w:semiHidden="0" w:uiPriority="68" w:unhideWhenUsed="0"/>
-    <w:lsdException w:name="Medium Grid 3 Accent 1" w:semiHidden="0" w:uiPriority="69" w:unhideWhenUsed="0"/>
-    <w:lsdException w:name="Dark List Accent 1" w:semiHidden="0" w:uiPriority="70" w:unhideWhenUsed="0"/>
-    <w:lsdException w:name="Colorful Shading Accent 1" w:semiHidden="0" w:uiPriority="71" w:unhideWhenUsed="0"/>
-    <w:lsdException w:name="Colorful List Accent 1" w:semiHidden="0" w:uiPriority="72" w:unhideWhenUsed="0"/>
-    <w:lsdException w:name="Colorful Grid Accent 1" w:semiHidden="0" w:uiPriority="73" w:unhideWhenUsed="0"/>
-    <w:lsdException w:name="Light Shading Accent 2" w:semiHidden="0" w:uiPriority="60" w:unhideWhenUsed="0"/>
-    <w:lsdException w:name="Light List Accent 2" w:semiHidden="0" w:uiPriority="61" w:unhideWhenUsed="0"/>
-    <w:lsdException w:name="Light Grid Accent 2" w:semiHidden="0" w:uiPriority="62" w:unhideWhenUsed="0"/>
-    <w:lsdException w:name="Medium Shading 1 Accent 2" w:semiHidden="0" w:uiPriority="63" w:unhideWhenUsed="0"/>
-    <w:lsdException w:name="Medium Shading 2 Accent 2" w:semiHidden="0" w:uiPriority="64" w:unhideWhenUsed="0"/>
-    <w:lsdException w:name="Medium List 1 Accent 2" w:semiHidden="0" w:uiPriority="65" w:unhideWhenUsed="0"/>
-    <w:lsdException w:name="Medium List 2 Accent 2" w:semiHidden="0" w:uiPriority="66" w:unhideWhenUsed="0"/>
-    <w:lsdException w:name="Medium Grid 1 Accent 2" w:semiHidden="0" w:uiPriority="67" w:unhideWhenUsed="0"/>
-    <w:lsdException w:name="Medium Grid 2 Accent 2" w:semiHidden="0" w:uiPriority="68" w:unhideWhenUsed="0"/>
-    <w:lsdException w:name="Medium Grid 3 Accent 2" w:semiHidden="0" w:uiPriority="69" w:unhideWhenUsed="0"/>
-    <w:lsdException w:name="Dark List Accent 2" w:semiHidden="0" w:uiPriority="70" w:unhideWhenUsed="0"/>
-    <w:lsdException w:name="Colorful Shading Accent 2" w:semiHidden="0" w:uiPriority="71" w:unhideWhenUsed="0"/>
-    <w:lsdException w:name="Colorful List Accent 2" w:semiHidden="0" w:uiPriority="72" w:unhideWhenUsed="0"/>
-    <w:lsdException w:name="Colorful Grid Accent 2" w:semiHidden="0" w:uiPriority="73" w:unhideWhenUsed="0"/>
-    <w:lsdException w:name="Light Shading Accent 3" w:semiHidden="0" w:uiPriority="60" w:unhideWhenUsed="0"/>
-    <w:lsdException w:name="Light List Accent 3" w:semiHidden="0" w:uiPriority="61" w:unhideWhenUsed="0"/>
-    <w:lsdException w:name="Light Grid Accent 3" w:semiHidden="0" w:uiPriority="62" w:unhideWhenUsed="0"/>
-    <w:lsdException w:name="Medium Shading 1 Accent 3" w:semiHidden="0" w:uiPriority="63" w:unhideWhenUsed="0"/>
-    <w:lsdException w:name="Medium Shading 2 Accent 3" w:semiHidden="0" w:uiPriority="64" w:unhideWhenUsed="0"/>
-    <w:lsdException w:name="Medium List 1 Accent 3" w:semiHidden="0" w:uiPriority="65" w:unhideWhenUsed="0"/>
-    <w:lsdException w:name="Medium List 2 Accent 3" w:semiHidden="0" w:uiPriority="66" w:unhideWhenUsed="0"/>
-    <w:lsdException w:name="Medium Grid 1 Accent 3" w:semiHidden="0" w:uiPriority="67" w:unhideWhenUsed="0"/>
-    <w:lsdException w:name="Medium Grid 2 Accent 3" w:semiHidden="0" w:uiPriority="68" w:unhideWhenUsed="0"/>
-    <w:lsdException w:name="Medium Grid 3 Accent 3" w:semiHidden="0" w:uiPriority="69" w:unhideWhenUsed="0"/>
-    <w:lsdException w:name="Dark List Accent 3" w:semiHidden="0" w:uiPriority="70" w:unhideWhenUsed="0"/>
-    <w:lsdException w:name="Colorful Shading Accent 3" w:semiHidden="0" w:uiPriority="71" w:unhideWhenUsed="0"/>
-    <w:lsdException w:name="Colorful List Accent 3" w:semiHidden="0" w:uiPriority="72" w:unhideWhenUsed="0"/>
-    <w:lsdException w:name="Colorful Grid Accent 3" w:semiHidden="0" w:uiPriority="73" w:unhideWhenUsed="0"/>
-    <w:lsdException w:name="Light Shading Accent 4" w:semiHidden="0" w:uiPriority="60" w:unhideWhenUsed="0"/>
-    <w:lsdException w:name="Light List Accent 4" w:semiHidden="0" w:uiPriority="61" w:unhideWhenUsed="0"/>
-    <w:lsdException w:name="Light Grid Accent 4" w:semiHidden="0" w:uiPriority="62" w:unhideWhenUsed="0"/>
-    <w:lsdException w:name="Medium Shading 1 Accent 4" w:semiHidden="0" w:uiPriority="63" w:unhideWhenUsed="0"/>
-    <w:lsdException w:name="Medium Shading 2 Accent 4" w:semiHidden="0" w:uiPriority="64" w:unhideWhenUsed="0"/>
-    <w:lsdException w:name="Medium List 1 Accent 4" w:semiHidden="0" w:uiPriority="65" w:unhideWhenUsed="0"/>
-    <w:lsdException w:name="Medium List 2 Accent 4" w:semiHidden="0" w:uiPriority="66" w:unhideWhenUsed="0"/>
-    <w:lsdException w:name="Medium Grid 1 Accent 4" w:semiHidden="0" w:uiPriority="67" w:unhideWhenUsed="0"/>
-    <w:lsdException w:name="Medium Grid 2 Accent 4" w:semiHidden="0" w:uiPriority="68" w:unhideWhenUsed="0"/>
-    <w:lsdException w:name="Medium Grid 3 Accent 4" w:semiHidden="0" w:uiPriority="69" w:unhideWhenUsed="0"/>
-    <w:lsdException w:name="Dark List Accent 4" w:semiHidden="0" w:uiPriority="70" w:unhideWhenUsed="0"/>
-    <w:lsdException w:name="Colorful Shading Accent 4" w:semiHidden="0" w:uiPriority="71" w:unhideWhenUsed="0"/>
-    <w:lsdException w:name="Colorful List Accent 4" w:semiHidden="0" w:uiPriority="72" w:unhideWhenUsed="0"/>
-    <w:lsdException w:name="Colorful Grid Accent 4" w:semiHidden="0" w:uiPriority="73" w:unhideWhenUsed="0"/>
-    <w:lsdException w:name="Light Shading Accent 5" w:semiHidden="0" w:uiPriority="60" w:unhideWhenUsed="0"/>
-    <w:lsdException w:name="Light List Accent 5" w:semiHidden="0" w:uiPriority="61" w:unhideWhenUsed="0"/>
-    <w:lsdException w:name="Light Grid Accent 5" w:semiHidden="0" w:uiPriority="62" w:unhideWhenUsed="0"/>
-    <w:lsdException w:name="Medium Shading 1 Accent 5" w:semiHidden="0" w:uiPriority="63" w:unhideWhenUsed="0"/>
-    <w:lsdException w:name="Medium Shading 2 Accent 5" w:semiHidden="0" w:uiPriority="64" w:unhideWhenUsed="0"/>
-    <w:lsdException w:name="Medium List 1 Accent 5" w:semiHidden="0" w:uiPriority="65" w:unhideWhenUsed="0"/>
-    <w:lsdException w:name="Medium List 2 Accent 5" w:semiHidden="0" w:uiPriority="66" w:unhideWhenUsed="0"/>
-    <w:lsdException w:name="Medium Grid 1 Accent 5" w:semiHidden="0" w:uiPriority="67" w:unhideWhenUsed="0"/>
-    <w:lsdException w:name="Medium Grid 2 Accent 5" w:semiHidden="0" w:uiPriority="68" w:unhideWhenUsed="0"/>
-    <w:lsdException w:name="Medium Grid 3 Accent 5" w:semiHidden="0" w:uiPriority="69" w:unhideWhenUsed="0"/>
-    <w:lsdException w:name="Dark List Accent 5" w:semiHidden="0" w:uiPriority="70" w:unhideWhenUsed="0"/>
-    <w:lsdException w:name="Colorful Shading Accent 5" w:semiHidden="0" w:uiPriority="71" w:unhideWhenUsed="0"/>
-    <w:lsdException w:name="Colorful List Accent 5" w:semiHidden="0" w:uiPriority="72" w:unhideWhenUsed="0"/>
-    <w:lsdException w:name="Colorful Grid Accent 5" w:semiHidden="0" w:uiPriority="73" w:unhideWhenUsed="0"/>
-    <w:lsdException w:name="Light Shading Accent 6" w:semiHidden="0" w:uiPriority="60" w:unhideWhenUsed="0"/>
-    <w:lsdException w:name="Light List Accent 6" w:semiHidden="0" w:uiPriority="61" w:unhideWhenUsed="0"/>
-    <w:lsdException w:name="Light Grid Accent 6" w:semiHidden="0" w:uiPriority="62" w:unhideWhenUsed="0"/>
-    <w:lsdException w:name="Medium Shading 1 Accent 6" w:semiHidden="0" w:uiPriority="63" w:unhideWhenUsed="0"/>
-    <w:lsdException w:name="Medium Shading 2 Accent 6" w:semiHidden="0" w:uiPriority="64" w:unhideWhenUsed="0"/>
-    <w:lsdException w:name="Medium List 1 Accent 6" w:semiHidden="0" w:uiPriority="65" w:unhideWhenUsed="0"/>
-    <w:lsdException w:name="Medium List 2 Accent 6" w:semiHidden="0" w:uiPriority="66" w:unhideWhenUsed="0"/>
-    <w:lsdException w:name="Medium Grid 1 Accent 6" w:semiHidden="0" w:uiPriority="67" w:unhideWhenUsed="0"/>
-    <w:lsdException w:name="Medium Grid 2 Accent 6" w:semiHidden="0" w:uiPriority="68" w:unhideWhenUsed="0"/>
-    <w:lsdException w:name="Medium Grid 3 Accent 6" w:semiHidden="0" w:uiPriority="69" w:unhideWhenUsed="0"/>
-    <w:lsdException w:name="Dark List Accent 6" w:semiHidden="0" w:uiPriority="70" w:unhideWhenUsed="0"/>
-    <w:lsdException w:name="Colorful Shading Accent 6" w:semiHidden="0" w:uiPriority="71" w:unhideWhenUsed="0"/>
-    <w:lsdException w:name="Colorful List Accent 6" w:semiHidden="0" w:uiPriority="72" w:unhideWhenUsed="0"/>
-    <w:lsdException w:name="Colorful Grid Accent 6" w:semiHidden="0" w:uiPriority="73" w:unhideWhenUsed="0"/>
-    <w:lsdException w:name="Subtle Emphasis" w:semiHidden="0" w:uiPriority="19" w:unhideWhenUsed="0" w:qFormat="1"/>
-    <w:lsdException w:name="Intense Emphasis" w:semiHidden="0" w:uiPriority="21" w:unhideWhenUsed="0" w:qFormat="1"/>
-    <w:lsdException w:name="Subtle Reference" w:semiHidden="0" w:uiPriority="31" w:unhideWhenUsed="0" w:qFormat="1"/>
-    <w:lsdException w:name="Intense Reference" w:semiHidden="0" w:uiPriority="32" w:unhideWhenUsed="0" w:qFormat="1"/>
-    <w:lsdException w:name="Book Title" w:semiHidden="0" w:uiPriority="33" w:unhideWhenUsed="0" w:qFormat="1"/>
-    <w:lsdException w:name="Bibliography" w:uiPriority="37"/>
-    <w:lsdException w:name="TOC Heading" w:uiPriority="39" w:qFormat="1"/>
-  </w:latentStyles>
-  <w:style w:type="paragraph" w:default="1" w:styleId="Normal">
-    <w:name w:val="Normal"/>
-    <w:qFormat/>
-    <w:rsid w:val="002A40C7"/>
-  </w:style>
-  <w:style w:type="paragraph" w:styleId="Heading1">
-    <w:name w:val="heading 1"/>
-    <w:basedOn w:val="Normal"/>
-    <w:next w:val="Normal"/>
-    <w:link w:val="Heading1Char"/>
-    <w:uiPriority w:val="9"/>
-    <w:qFormat/>
-    <w:rsid w:val="009D7BEE"/>
-    <w:pPr>
-      <w:keepNext/>
-      <w:keepLines/>
-      <w:spacing w:before="480" w:after="0"/>
-      <w:outlineLvl w:val="0"/>
-    </w:pPr>
-    <w:rPr>
-      <w:rFonts w:asciiTheme="majorHAnsi" w:eastAsiaTheme="majorEastAsia" w:hAnsiTheme="majorHAnsi" w:cstheme="majorBidi"/>
-      <w:b/>
-      <w:bCs/>
-      <w:color w:val="365F91" w:themeColor="accent1" w:themeShade="BF"/>
-      <w:sz w:val="28"/>
-      <w:szCs w:val="28"/>
-    </w:rPr>
-  </w:style>
-  <w:style w:type="paragraph" w:styleId="Heading2">
-    <w:name w:val="heading 2"/>
-    <w:basedOn w:val="Normal"/>
-    <w:next w:val="Normal"/>
-    <w:link w:val="Heading2Char"/>
-    <w:uiPriority w:val="9"/>
-    <w:unhideWhenUsed/>
-    <w:qFormat/>
-    <w:rsid w:val="009D7BEE"/>
-    <w:pPr>
-      <w:keepNext/>
-      <w:keepLines/>
-      <w:spacing w:before="200" w:after="0"/>
-      <w:outlineLvl w:val="1"/>
-    </w:pPr>
-    <w:rPr>
-      <w:rFonts w:asciiTheme="majorHAnsi" w:eastAsiaTheme="majorEastAsia" w:hAnsiTheme="majorHAnsi" w:cstheme="majorBidi"/>
-      <w:b/>
-      <w:bCs/>
-      <w:color w:val="4F81BD" w:themeColor="accent1"/>
-      <w:sz w:val="26"/>
-      <w:szCs w:val="26"/>
-    </w:rPr>
-  </w:style>
-  <w:style w:type="paragraph" w:styleId="Heading3">
-    <w:name w:val="heading 3"/>
-    <w:basedOn w:val="Normal"/>
-    <w:next w:val="Normal"/>
-    <w:link w:val="Heading3Char"/>
-    <w:uiPriority w:val="9"/>
-    <w:unhideWhenUsed/>
-    <w:qFormat/>
-    <w:rsid w:val="009D7BEE"/>
-    <w:pPr>
-      <w:keepNext/>
-      <w:keepLines/>
-      <w:spacing w:before="200" w:after="0"/>
-      <w:outlineLvl w:val="2"/>
-    </w:pPr>
-    <w:rPr>
-      <w:rFonts w:asciiTheme="majorHAnsi" w:eastAsiaTheme="majorEastAsia" w:hAnsiTheme="majorHAnsi" w:cstheme="majorBidi"/>
-      <w:b/>
-      <w:bCs/>
-      <w:color w:val="4F81BD" w:themeColor="accent1"/>
-    </w:rPr>
-  </w:style>
-  <w:style w:type="character" w:default="1" w:styleId="DefaultParagraphFont">
-    <w:name w:val="Default Paragraph Font"/>
-    <w:uiPriority w:val="1"/>
-    <w:semiHidden/>
-    <w:unhideWhenUsed/>
-  </w:style>
-  <w:style w:type="table" w:default="1" w:styleId="TableNormal">
-    <w:name w:val="Normal Table"/>
-    <w:uiPriority w:val="99"/>
-    <w:semiHidden/>
-    <w:unhideWhenUsed/>
-    <w:tblPr>
-      <w:tblInd w:w="0" w:type="dxa"/>
-      <w:tblCellMar>
-        <w:top w:w="0" w:type="dxa"/>
-        <w:left w:w="108" w:type="dxa"/>
-        <w:bottom w:w="0" w:type="dxa"/>
-        <w:right w:w="108" w:type="dxa"/>
-      </w:tblCellMar>
-    </w:tblPr>
-  </w:style>
-  <w:style w:type="numbering" w:default="1" w:styleId="NoList">
-    <w:name w:val="No List"/>
-    <w:uiPriority w:val="99"/>
-    <w:semiHidden/>
-    <w:unhideWhenUsed/>
-  </w:style>
-  <w:style w:type="table" w:customStyle="1" w:styleId="Table-Item">
-    <w:name w:val="Table-Item"/>
-    <w:uiPriority w:val="99"/>
-    <w:rsid w:val="00F23C36"/>
-    <w:pPr>
-      <w:spacing w:after="0" w:line="240" w:lineRule="auto"/>
-    </w:pPr>
-    <w:rPr>
-      <w:rFonts w:eastAsiaTheme="minorEastAsia"/>
-      <w:sz w:val="20"/>
-      <w:szCs w:val="20"/>
-      <w:lang w:eastAsia="zh-CN"/>
-    </w:rPr>
-    <w:tblPr>
-      <w:tblInd w:w="0" w:type="dxa"/>
-      <w:tblCellMar>
-        <w:top w:w="0" w:type="dxa"/>
-        <w:left w:w="108" w:type="dxa"/>
-        <w:bottom w:w="0" w:type="dxa"/>
-        <w:right w:w="108" w:type="dxa"/>
-      </w:tblCellMar>
-    </w:tblPr>
-    <w:tblStylePr w:type="firstRow">
-      <w:tblPr/>
-      <w:tcPr>
-        <w:shd w:val="clear" w:color="auto" w:fill="D9D9D9" w:themeFill="background1" w:themeFillShade="D9"/>
-      </w:tcPr>
-    </w:tblStylePr>
-    <w:tblStylePr w:type="nwCell">
-      <w:tblPr/>
-      <w:tcPr>
-        <w:tcBorders>
-          <w:top w:val="nil"/>
-          <w:left w:val="nil"/>
-          <w:bottom w:val="nil"/>
-          <w:right w:val="nil"/>
-          <w:insideH w:val="nil"/>
-          <w:insideV w:val="nil"/>
-          <w:tl2br w:val="nil"/>
-          <w:tr2bl w:val="nil"/>
-        </w:tcBorders>
-      </w:tcPr>
-    </w:tblStylePr>
-  </w:style>
-  <w:style w:type="table" w:customStyle="1" w:styleId="lightgrey">
-    <w:name w:val="light grey"/>
-    <w:basedOn w:val="LightShading"/>
-    <w:uiPriority w:val="99"/>
-    <w:rsid w:val="00567355"/>
-    <w:rPr>
-      <w:sz w:val="20"/>
-      <w:szCs w:val="20"/>
-      <w:lang w:val="en-US" w:eastAsia="en-AU"/>
-    </w:rPr>
-    <w:tblPr>
-      <w:tblStyleRowBandSize w:val="1"/>
-      <w:tblStyleColBandSize w:val="1"/>
-      <w:tblInd w:w="0" w:type="dxa"/>
-      <w:tblBorders>
-        <w:top w:val="single" w:sz="8" w:space="0" w:color="000000" w:themeColor="text1"/>
-        <w:bottom w:val="single" w:sz="8" w:space="0" w:color="000000" w:themeColor="text1"/>
-      </w:tblBorders>
-      <w:tblCellMar>
-        <w:top w:w="0" w:type="dxa"/>
-        <w:left w:w="108" w:type="dxa"/>
-        <w:bottom w:w="0" w:type="dxa"/>
-        <w:right w:w="108" w:type="dxa"/>
-      </w:tblCellMar>
-    </w:tblPr>
-    <w:tblStylePr w:type="firstRow">
-      <w:pPr>
-        <w:spacing w:before="0" w:after="0" w:line="240" w:lineRule="auto"/>
-      </w:pPr>
-      <w:rPr>
-        <w:b/>
-        <w:bCs/>
-      </w:rPr>
-      <w:tblPr/>
-      <w:tcPr>
-        <w:tcBorders>
-          <w:top w:val="single" w:sz="8" w:space="0" w:color="000000" w:themeColor="text1"/>
-          <w:left w:val="nil"/>
-          <w:bottom w:val="single" w:sz="8" w:space="0" w:color="000000" w:themeColor="text1"/>
-          <w:right w:val="nil"/>
-          <w:insideH w:val="nil"/>
-          <w:insideV w:val="nil"/>
-        </w:tcBorders>
-      </w:tcPr>
-    </w:tblStylePr>
-    <w:tblStylePr w:type="lastRow">
-      <w:pPr>
-        <w:spacing w:before="0" w:after="0" w:line="240" w:lineRule="auto"/>
-      </w:pPr>
-      <w:rPr>
-        <w:b/>
-        <w:bCs/>
-      </w:rPr>
-      <w:tblPr/>
-      <w:tcPr>
-        <w:tcBorders>
-          <w:top w:val="single" w:sz="8" w:space="0" w:color="000000" w:themeColor="text1"/>
-          <w:left w:val="nil"/>
-          <w:bottom w:val="single" w:sz="8" w:space="0" w:color="000000" w:themeColor="text1"/>
-          <w:right w:val="nil"/>
-          <w:insideH w:val="nil"/>
-          <w:insideV w:val="nil"/>
-        </w:tcBorders>
-      </w:tcPr>
-    </w:tblStylePr>
-    <w:tblStylePr w:type="firstCol">
-      <w:rPr>
-        <w:b/>
-        <w:bCs/>
-      </w:rPr>
-    </w:tblStylePr>
-    <w:tblStylePr w:type="lastCol">
-      <w:rPr>
-        <w:b/>
-        <w:bCs/>
-      </w:rPr>
-    </w:tblStylePr>
-    <w:tblStylePr w:type="band1Vert">
-      <w:tblPr/>
-      <w:tcPr>
-        <w:tcBorders>
-          <w:left w:val="nil"/>
-          <w:right w:val="nil"/>
-          <w:insideH w:val="nil"/>
-          <w:insideV w:val="nil"/>
-        </w:tcBorders>
-        <w:shd w:val="clear" w:color="auto" w:fill="C0C0C0" w:themeFill="text1" w:themeFillTint="3F"/>
-      </w:tcPr>
-    </w:tblStylePr>
-    <w:tblStylePr w:type="band1Horz">
-      <w:tblPr/>
-      <w:tcPr>
-        <w:tcBorders>
-          <w:left w:val="nil"/>
-          <w:right w:val="nil"/>
-          <w:insideH w:val="nil"/>
-          <w:insideV w:val="nil"/>
-        </w:tcBorders>
-        <w:shd w:val="clear" w:color="auto" w:fill="C0C0C0" w:themeFill="text1" w:themeFillTint="3F"/>
-      </w:tcPr>
-    </w:tblStylePr>
-  </w:style>
-  <w:style w:type="table" w:styleId="LightShading">
-    <w:name w:val="Light Shading"/>
-    <w:basedOn w:val="TableNormal"/>
-    <w:uiPriority w:val="60"/>
-    <w:rsid w:val="00567355"/>
-    <w:pPr>
-      <w:spacing w:after="0" w:line="240" w:lineRule="auto"/>
-    </w:pPr>
-    <w:rPr>
-      <w:color w:val="000000" w:themeColor="text1" w:themeShade="BF"/>
-    </w:rPr>
-    <w:tblPr>
-      <w:tblStyleRowBandSize w:val="1"/>
-      <w:tblStyleColBandSize w:val="1"/>
-      <w:tblInd w:w="0" w:type="dxa"/>
-      <w:tblBorders>
-        <w:top w:val="single" w:sz="8" w:space="0" w:color="000000" w:themeColor="text1"/>
-        <w:bottom w:val="single" w:sz="8" w:space="0" w:color="000000" w:themeColor="text1"/>
-      </w:tblBorders>
-      <w:tblCellMar>
-        <w:top w:w="0" w:type="dxa"/>
-        <w:left w:w="108" w:type="dxa"/>
-        <w:bottom w:w="0" w:type="dxa"/>
-        <w:right w:w="108" w:type="dxa"/>
-      </w:tblCellMar>
-    </w:tblPr>
-    <w:tblStylePr w:type="firstRow">
-      <w:pPr>
-        <w:spacing w:before="0" w:after="0" w:line="240" w:lineRule="auto"/>
-      </w:pPr>
-      <w:rPr>
-        <w:b/>
-        <w:bCs/>
-      </w:rPr>
-      <w:tblPr/>
-      <w:tcPr>
-        <w:tcBorders>
-          <w:top w:val="single" w:sz="8" w:space="0" w:color="000000" w:themeColor="text1"/>
-          <w:left w:val="nil"/>
-          <w:bottom w:val="single" w:sz="8" w:space="0" w:color="000000" w:themeColor="text1"/>
-          <w:right w:val="nil"/>
-          <w:insideH w:val="nil"/>
-          <w:insideV w:val="nil"/>
-        </w:tcBorders>
-      </w:tcPr>
-    </w:tblStylePr>
-    <w:tblStylePr w:type="lastRow">
-      <w:pPr>
-        <w:spacing w:before="0" w:after="0" w:line="240" w:lineRule="auto"/>
-      </w:pPr>
-      <w:rPr>
-        <w:b/>
-        <w:bCs/>
-      </w:rPr>
-      <w:tblPr/>
-      <w:tcPr>
-        <w:tcBorders>
-          <w:top w:val="single" w:sz="8" w:space="0" w:color="000000" w:themeColor="text1"/>
-          <w:left w:val="nil"/>
-          <w:bottom w:val="single" w:sz="8" w:space="0" w:color="000000" w:themeColor="text1"/>
-          <w:right w:val="nil"/>
-          <w:insideH w:val="nil"/>
-          <w:insideV w:val="nil"/>
-        </w:tcBorders>
-      </w:tcPr>
-    </w:tblStylePr>
-    <w:tblStylePr w:type="firstCol">
-      <w:rPr>
-        <w:b/>
-        <w:bCs/>
-      </w:rPr>
-    </w:tblStylePr>
-    <w:tblStylePr w:type="lastCol">
-      <w:rPr>
-        <w:b/>
-        <w:bCs/>
-      </w:rPr>
-    </w:tblStylePr>
-    <w:tblStylePr w:type="band1Vert">
-      <w:tblPr/>
-      <w:tcPr>
-        <w:tcBorders>
-          <w:left w:val="nil"/>
-          <w:right w:val="nil"/>
-          <w:insideH w:val="nil"/>
-          <w:insideV w:val="nil"/>
-        </w:tcBorders>
-        <w:shd w:val="clear" w:color="auto" w:fill="C0C0C0" w:themeFill="text1" w:themeFillTint="3F"/>
-      </w:tcPr>
-    </w:tblStylePr>
-    <w:tblStylePr w:type="band1Horz">
-      <w:tblPr/>
-      <w:tcPr>
-        <w:tcBorders>
-          <w:left w:val="nil"/>
-          <w:right w:val="nil"/>
-          <w:insideH w:val="nil"/>
-          <w:insideV w:val="nil"/>
-        </w:tcBorders>
-        <w:shd w:val="clear" w:color="auto" w:fill="C0C0C0" w:themeFill="text1" w:themeFillTint="3F"/>
-      </w:tcPr>
-    </w:tblStylePr>
-  </w:style>
-  <w:style w:type="table" w:customStyle="1" w:styleId="tableYellow">
-    <w:name w:val="tableYellow"/>
-    <w:basedOn w:val="TableNormal"/>
-    <w:uiPriority w:val="99"/>
-    <w:rsid w:val="00567355"/>
-    <w:pPr>
-      <w:spacing w:after="0" w:line="240" w:lineRule="auto"/>
-    </w:pPr>
-    <w:rPr>
-      <w:lang w:val="en-US"/>
-    </w:rPr>
-    <w:tblPr>
-      <w:tblInd w:w="0" w:type="dxa"/>
-      <w:tblBorders>
-        <w:top w:val="single" w:sz="4" w:space="0" w:color="auto"/>
-        <w:left w:val="single" w:sz="4" w:space="0" w:color="auto"/>
-        <w:bottom w:val="single" w:sz="4" w:space="0" w:color="auto"/>
-        <w:right w:val="single" w:sz="4" w:space="0" w:color="auto"/>
-        <w:insideH w:val="single" w:sz="4" w:space="0" w:color="auto"/>
-        <w:insideV w:val="single" w:sz="4" w:space="0" w:color="auto"/>
-      </w:tblBorders>
-      <w:tblCellMar>
-        <w:top w:w="0" w:type="dxa"/>
-        <w:left w:w="108" w:type="dxa"/>
-        <w:bottom w:w="0" w:type="dxa"/>
-        <w:right w:w="108" w:type="dxa"/>
-      </w:tblCellMar>
-    </w:tblPr>
-    <w:tcPr>
-      <w:shd w:val="clear" w:color="auto" w:fill="FFFF99"/>
-    </w:tcPr>
-    <w:tblStylePr w:type="firstRow">
-      <w:tblPr/>
-      <w:tcPr>
-        <w:shd w:val="clear" w:color="auto" w:fill="FFCC00"/>
-      </w:tcPr>
-    </w:tblStylePr>
-  </w:style>
-  <w:style w:type="table" w:customStyle="1" w:styleId="olasummarytable">
-    <w:name w:val="ola_summary_table"/>
-    <w:basedOn w:val="TableNormal"/>
-    <w:uiPriority w:val="99"/>
-    <w:rsid w:val="00555578"/>
-    <w:pPr>
-      <w:spacing w:after="0" w:line="240" w:lineRule="auto"/>
-    </w:pPr>
-    <w:tblPr>
-      <w:jc w:val="center"/>
-      <w:tblInd w:w="0" w:type="dxa"/>
-      <w:tblBorders>
-        <w:top w:val="single" w:sz="4" w:space="0" w:color="auto"/>
-        <w:left w:val="single" w:sz="4" w:space="0" w:color="auto"/>
-        <w:bottom w:val="single" w:sz="4" w:space="0" w:color="auto"/>
-        <w:right w:val="single" w:sz="4" w:space="0" w:color="auto"/>
-        <w:insideH w:val="single" w:sz="4" w:space="0" w:color="auto"/>
-        <w:insideV w:val="single" w:sz="4" w:space="0" w:color="auto"/>
-      </w:tblBorders>
-      <w:tblCellMar>
-        <w:top w:w="0" w:type="dxa"/>
-        <w:left w:w="108" w:type="dxa"/>
-        <w:bottom w:w="0" w:type="dxa"/>
-        <w:right w:w="108" w:type="dxa"/>
-      </w:tblCellMar>
-    </w:tblPr>
-    <w:trPr>
-      <w:jc w:val="center"/>
-    </w:trPr>
-    <w:tcPr>
-      <w:shd w:val="clear" w:color="auto" w:fill="9CE1F7"/>
-    </w:tcPr>
-  </w:style>
-  <w:style w:type="paragraph" w:styleId="ListParagraph">
-    <w:name w:val="List Paragraph"/>
-    <w:basedOn w:val="Normal"/>
-    <w:uiPriority w:val="34"/>
-    <w:qFormat/>
-    <w:rsid w:val="002A40C7"/>
-    <w:pPr>
-      <w:ind w:left="720"/>
-      <w:contextualSpacing/>
-    </w:pPr>
-  </w:style>
-  <w:style w:type="paragraph" w:styleId="ListContinue">
-    <w:name w:val="List Continue"/>
+  <w:style w:type="paragraph" w:styleId="BlockText">
+    <w:name w:val="Block Text"/>
     <w:basedOn w:val="Normal"/>
     <w:uiPriority w:val="99"/>
     <w:unhideWhenUsed/>
-    <w:rsid w:val="002A40C7"/>
-    <w:pPr>
-      <w:spacing w:after="120"/>
-      <w:ind w:left="283"/>
-      <w:contextualSpacing/>
-    </w:pPr>
-  </w:style>
-  <w:style w:type="paragraph" w:styleId="ListContinue2">
-    <w:name w:val="List Continue 2"/>
+    <w:rsid w:val="00525773"/>
+    <w:pPr>
+      <w:pBdr>
+        <w:top w:val="single" w:sz="2" w:space="10" w:color="4F81BD" w:themeColor="accent1"/>
+        <w:left w:val="single" w:sz="2" w:space="10" w:color="4F81BD" w:themeColor="accent1"/>
+        <w:bottom w:val="single" w:sz="2" w:space="10" w:color="4F81BD" w:themeColor="accent1"/>
+        <w:right w:val="single" w:sz="2" w:space="10" w:color="4F81BD" w:themeColor="accent1"/>
+      </w:pBdr>
+      <w:ind w:left="1152" w:right="1152"/>
+    </w:pPr>
+    <w:rPr>
+      <w:rFonts w:eastAsiaTheme="minorEastAsia"/>
+      <w:i/>
+      <w:iCs/>
+      <w:color w:val="4F81BD" w:themeColor="accent1"/>
+    </w:rPr>
+  </w:style>
+  <w:style w:type="paragraph" w:styleId="BodyText">
+    <w:name w:val="Body Text"/>
     <w:basedOn w:val="Normal"/>
+    <w:link w:val="BodyTextChar"/>
     <w:uiPriority w:val="99"/>
     <w:unhideWhenUsed/>
-    <w:rsid w:val="002A40C7"/>
+    <w:rsid w:val="00525773"/>
     <w:pPr>
       <w:spacing w:after="120"/>
-      <w:ind w:left="566"/>
-      <w:contextualSpacing/>
-    </w:pPr>
-  </w:style>
-  <w:style w:type="paragraph" w:styleId="ListContinue3">
-    <w:name w:val="List Continue 3"/>
-    <w:basedOn w:val="Normal"/>
+    </w:pPr>
+  </w:style>
+  <w:style w:type="character" w:customStyle="1" w:styleId="BodyTextChar">
+    <w:name w:val="Body Text Char"/>
+    <w:basedOn w:val="DefaultParagraphFont"/>
+    <w:link w:val="BodyText"/>
     <w:uiPriority w:val="99"/>
-    <w:unhideWhenUsed/>
-    <w:rsid w:val="002A40C7"/>
-    <w:pPr>
-      <w:spacing w:after="120"/>
-      <w:ind w:left="849"/>
-      <w:contextualSpacing/>
-    </w:pPr>
-  </w:style>
-  <w:style w:type="paragraph" w:styleId="ListContinue4">
-    <w:name w:val="List Continue 4"/>
-    <w:basedOn w:val="Normal"/>
-    <w:uiPriority w:val="99"/>
-    <w:unhideWhenUsed/>
-    <w:rsid w:val="002A40C7"/>
-    <w:pPr>
-      <w:spacing w:after="120"/>
-      <w:ind w:left="1132"/>
-      <w:contextualSpacing/>
-    </w:pPr>
-  </w:style>
-  <w:style w:type="paragraph" w:styleId="ListContinue5">
-    <w:name w:val="List Continue 5"/>
-    <w:basedOn w:val="Normal"/>
-    <w:uiPriority w:val="99"/>
-    <w:unhideWhenUsed/>
-    <w:rsid w:val="002A40C7"/>
-    <w:pPr>
-      <w:spacing w:after="120"/>
-      <w:ind w:left="1415"/>
-      <w:contextualSpacing/>
-    </w:pPr>
-  </w:style>
-  <w:style w:type="paragraph" w:styleId="ListNumber">
-    <w:name w:val="List Number"/>
-    <w:basedOn w:val="Normal"/>
-    <w:uiPriority w:val="99"/>
-    <w:unhideWhenUsed/>
-    <w:rsid w:val="002A40C7"/>
-    <w:pPr>
-      <w:numPr>
-        <w:numId w:val="14"/>
-      </w:numPr>
-      <w:contextualSpacing/>
-    </w:pPr>
-  </w:style>
-  <w:style w:type="paragraph" w:styleId="ListNumber2">
-    <w:name w:val="List Number 2"/>
-    <w:basedOn w:val="Normal"/>
-    <w:uiPriority w:val="99"/>
-    <w:unhideWhenUsed/>
-    <w:rsid w:val="002A40C7"/>
-    <w:pPr>
-      <w:numPr>
-        <w:numId w:val="15"/>
-      </w:numPr>
-      <w:contextualSpacing/>
-    </w:pPr>
-  </w:style>
-  <w:style w:type="paragraph" w:styleId="ListNumber3">
-    <w:name w:val="List Number 3"/>
-    <w:basedOn w:val="Normal"/>
-    <w:uiPriority w:val="99"/>
-    <w:unhideWhenUsed/>
-    <w:rsid w:val="002A40C7"/>
-    <w:pPr>
-      <w:numPr>
-        <w:numId w:val="16"/>
-      </w:numPr>
-      <w:contextualSpacing/>
-    </w:pPr>
-  </w:style>
-  <w:style w:type="paragraph" w:styleId="ListNumber4">
-    <w:name w:val="List Number 4"/>
-    <w:basedOn w:val="Normal"/>
-    <w:uiPriority w:val="99"/>
-    <w:unhideWhenUsed/>
-    <w:rsid w:val="002A40C7"/>
-    <w:pPr>
-      <w:numPr>
-        <w:numId w:val="17"/>
-      </w:numPr>
-      <w:contextualSpacing/>
-    </w:pPr>
-  </w:style>
-  <w:style w:type="paragraph" w:styleId="ListNumber5">
-    <w:name w:val="List Number 5"/>
-    <w:basedOn w:val="Normal"/>
-    <w:uiPriority w:val="99"/>
-    <w:unhideWhenUsed/>
-    <w:rsid w:val="002A40C7"/>
-    <w:pPr>
-      <w:numPr>
-        <w:numId w:val="18"/>
-      </w:numPr>
-      <w:contextualSpacing/>
-    </w:pPr>
-  </w:style>
-  <w:style w:type="paragraph" w:styleId="ListBullet">
-    <w:name w:val="List Bullet"/>
-    <w:basedOn w:val="Normal"/>
-    <w:uiPriority w:val="99"/>
-    <w:unhideWhenUsed/>
-    <w:rsid w:val="002A40C7"/>
-    <w:pPr>
-      <w:numPr>
-        <w:numId w:val="9"/>
-      </w:numPr>
-      <w:contextualSpacing/>
-    </w:pPr>
-  </w:style>
-  <w:style w:type="paragraph" w:styleId="ListBullet2">
-    <w:name w:val="List Bullet 2"/>
-    <w:basedOn w:val="Normal"/>
-    <w:uiPriority w:val="99"/>
-    <w:unhideWhenUsed/>
-    <w:rsid w:val="002A40C7"/>
-    <w:pPr>
-      <w:numPr>
-        <w:numId w:val="10"/>
-      </w:numPr>
-      <w:contextualSpacing/>
-    </w:pPr>
-  </w:style>
-  <w:style w:type="paragraph" w:styleId="ListBullet3">
-    <w:name w:val="List Bullet 3"/>
-    <w:basedOn w:val="Normal"/>
-    <w:uiPriority w:val="99"/>
-    <w:unhideWhenUsed/>
-    <w:rsid w:val="002A40C7"/>
-    <w:pPr>
-      <w:numPr>
-        <w:numId w:val="11"/>
-      </w:numPr>
-      <w:contextualSpacing/>
-    </w:pPr>
-  </w:style>
-  <w:style w:type="paragraph" w:styleId="ListBullet4">
-    <w:name w:val="List Bullet 4"/>
-    <w:basedOn w:val="Normal"/>
-    <w:uiPriority w:val="99"/>
-    <w:unhideWhenUsed/>
-    <w:rsid w:val="002A40C7"/>
-    <w:pPr>
-      <w:numPr>
-        <w:numId w:val="12"/>
-      </w:numPr>
-      <w:contextualSpacing/>
-    </w:pPr>
-  </w:style>
-  <w:style w:type="paragraph" w:styleId="ListBullet5">
-    <w:name w:val="List Bullet 5"/>
-    <w:basedOn w:val="Normal"/>
-    <w:uiPriority w:val="99"/>
-    <w:unhideWhenUsed/>
-    <w:rsid w:val="002A40C7"/>
-    <w:pPr>
-      <w:numPr>
-        <w:numId w:val="13"/>
-      </w:numPr>
-      <w:contextualSpacing/>
-    </w:pPr>
-  </w:style>
-  <w:style w:type="paragraph" w:styleId="BalloonText">
-    <w:name w:val="Balloon Text"/>
-    <w:basedOn w:val="Normal"/>
-    <w:link w:val="BalloonTextChar"/>
-    <w:uiPriority w:val="99"/>
-    <w:semiHidden/>
-    <w:unhideWhenUsed/>
-    <w:rsid w:val="005E4854"/>
-    <w:pPr>
-      <w:spacing w:after="0" w:line="240" w:lineRule="auto"/>
-    </w:pPr>
-    <w:rPr>
-      <w:rFonts w:ascii="Tahoma" w:hAnsi="Tahoma" w:cs="Tahoma"/>
-      <w:sz w:val="16"/>
-      <w:szCs w:val="16"/>
-    </w:rPr>
-  </w:style>
-  <w:style w:type="character" w:customStyle="1" w:styleId="BalloonTextChar">
-    <w:name w:val="Balloon Text Char"/>
-    <w:basedOn w:val="DefaultParagraphFont"/>
-    <w:link w:val="BalloonText"/>
-    <w:uiPriority w:val="99"/>
-    <w:semiHidden/>
-    <w:rsid w:val="005E4854"/>
-    <w:rPr>
-      <w:rFonts w:ascii="Tahoma" w:hAnsi="Tahoma" w:cs="Tahoma"/>
-      <w:sz w:val="16"/>
-      <w:szCs w:val="16"/>
-    </w:rPr>
-  </w:style>
-  <w:style w:type="paragraph" w:styleId="Caption">
-    <w:name w:val="caption"/>
-    <w:basedOn w:val="Normal"/>
-    <w:next w:val="Normal"/>
-    <w:uiPriority w:val="35"/>
-    <w:unhideWhenUsed/>
-    <w:qFormat/>
-    <w:rsid w:val="005E4854"/>
-    <w:pPr>
-      <w:spacing w:line="240" w:lineRule="auto"/>
-    </w:pPr>
-    <w:rPr>
-      <w:b/>
-      <w:bCs/>
-      <w:color w:val="4F81BD" w:themeColor="accent1"/>
-      <w:sz w:val="18"/>
-      <w:szCs w:val="18"/>
-    </w:rPr>
-  </w:style>
-  <w:style w:type="character" w:customStyle="1" w:styleId="Heading1Char">
-    <w:name w:val="Heading 1 Char"/>
-    <w:basedOn w:val="DefaultParagraphFont"/>
-    <w:link w:val="Heading1"/>
-    <w:uiPriority w:val="9"/>
-    <w:rsid w:val="009D7BEE"/>
-    <w:rPr>
-      <w:rFonts w:asciiTheme="majorHAnsi" w:eastAsiaTheme="majorEastAsia" w:hAnsiTheme="majorHAnsi" w:cstheme="majorBidi"/>
-      <w:b/>
-      <w:bCs/>
-      <w:color w:val="365F91" w:themeColor="accent1" w:themeShade="BF"/>
-      <w:sz w:val="28"/>
-      <w:szCs w:val="28"/>
-    </w:rPr>
-  </w:style>
-  <w:style w:type="character" w:customStyle="1" w:styleId="Heading2Char">
-    <w:name w:val="Heading 2 Char"/>
-    <w:basedOn w:val="DefaultParagraphFont"/>
-    <w:link w:val="Heading2"/>
-    <w:uiPriority w:val="9"/>
-    <w:rsid w:val="009D7BEE"/>
-    <w:rPr>
-      <w:rFonts w:asciiTheme="majorHAnsi" w:eastAsiaTheme="majorEastAsia" w:hAnsiTheme="majorHAnsi" w:cstheme="majorBidi"/>
-      <w:b/>
-      <w:bCs/>
-      <w:color w:val="4F81BD" w:themeColor="accent1"/>
-      <w:sz w:val="26"/>
-      <w:szCs w:val="26"/>
-    </w:rPr>
-  </w:style>
-  <w:style w:type="character" w:customStyle="1" w:styleId="Heading3Char">
-    <w:name w:val="Heading 3 Char"/>
-    <w:basedOn w:val="DefaultParagraphFont"/>
-    <w:link w:val="Heading3"/>
-    <w:uiPriority w:val="9"/>
-    <w:rsid w:val="009D7BEE"/>
-    <w:rPr>
-      <w:rFonts w:asciiTheme="majorHAnsi" w:eastAsiaTheme="majorEastAsia" w:hAnsiTheme="majorHAnsi" w:cstheme="majorBidi"/>
-      <w:b/>
-      <w:bCs/>
-      <w:color w:val="4F81BD" w:themeColor="accent1"/>
-    </w:rPr>
-  </w:style>
-  <w:style w:type="paragraph" w:styleId="Index1">
-    <w:name w:val="index 1"/>
-    <w:basedOn w:val="Heading1"/>
-    <w:next w:val="Normal"/>
-    <w:autoRedefine/>
-    <w:uiPriority w:val="99"/>
-    <w:unhideWhenUsed/>
-    <w:rsid w:val="009D7BEE"/>
-    <w:pPr>
-      <w:spacing w:line="240" w:lineRule="auto"/>
-      <w:ind w:left="220" w:hanging="220"/>
-    </w:pPr>
-    <w:rPr>
-      <w:color w:val="auto"/>
-    </w:rPr>
-  </w:style>
-  <w:style w:type="paragraph" w:styleId="Index2">
-    <w:name w:val="index 2"/>
-    <w:basedOn w:val="Heading1"/>
-    <w:next w:val="Normal"/>
-    <w:autoRedefine/>
-    <w:uiPriority w:val="99"/>
-    <w:unhideWhenUsed/>
-    <w:rsid w:val="009D7BEE"/>
-    <w:pPr>
-      <w:spacing w:line="240" w:lineRule="auto"/>
-      <w:ind w:left="440" w:hanging="220"/>
-    </w:pPr>
-    <w:rPr>
-      <w:color w:val="auto"/>
-    </w:rPr>
-  </w:style>
-  <w:style w:type="paragraph" w:styleId="Index3">
-    <w:name w:val="index 3"/>
-    <w:basedOn w:val="Heading3"/>
-    <w:next w:val="Normal"/>
-    <w:autoRedefine/>
-    <w:uiPriority w:val="99"/>
-    <w:unhideWhenUsed/>
-    <w:rsid w:val="009D7BEE"/>
-    <w:pPr>
-      <w:spacing w:line="240" w:lineRule="auto"/>
-      <w:ind w:left="660" w:hanging="220"/>
-    </w:pPr>
-    <w:rPr>
-      <w:color w:val="auto"/>
-    </w:rPr>
-  </w:style>
-  <w:style w:type="paragraph" w:customStyle="1" w:styleId="ActHead6">
-    <w:name w:val="ActHead 6"/>
-    <w:aliases w:val="as"/>
-    <w:basedOn w:val="Normal"/>
-    <w:next w:val="ActHead7"/>
-    <w:qFormat/>
-    <w:rsid w:val="00CF3BB3"/>
-    <w:pPr>
-      <w:keepNext/>
-      <w:keepLines/>
-      <w:spacing w:after="0" w:line="240" w:lineRule="auto"/>
-      <w:ind w:left="1134" w:hanging="1134"/>
-      <w:outlineLvl w:val="5"/>
-    </w:pPr>
-    <w:rPr>
-      <w:rFonts w:ascii="Arial" w:eastAsia="Times New Roman" w:hAnsi="Arial" w:cs="Times New Roman"/>
-      <w:b/>
-      <w:kern w:val="28"/>
-      <w:sz w:val="32"/>
-      <w:szCs w:val="20"/>
-      <w:lang w:eastAsia="en-AU"/>
-    </w:rPr>
-  </w:style>
-  <w:style w:type="paragraph" w:customStyle="1" w:styleId="ActHead7">
-    <w:name w:val="ActHead 7"/>
-    <w:aliases w:val="ap"/>
-    <w:basedOn w:val="Normal"/>
-    <w:next w:val="ItemHead"/>
-    <w:qFormat/>
-    <w:rsid w:val="00CF3BB3"/>
-    <w:pPr>
-      <w:keepNext/>
-      <w:keepLines/>
-      <w:spacing w:before="280" w:after="0" w:line="240" w:lineRule="auto"/>
-      <w:ind w:left="1134" w:hanging="1134"/>
-      <w:outlineLvl w:val="6"/>
-    </w:pPr>
-    <w:rPr>
-      <w:rFonts w:ascii="Arial" w:eastAsia="Times New Roman" w:hAnsi="Arial" w:cs="Times New Roman"/>
-      <w:b/>
-      <w:kern w:val="28"/>
-      <w:sz w:val="28"/>
-      <w:szCs w:val="20"/>
-      <w:lang w:eastAsia="en-AU"/>
-    </w:rPr>
-  </w:style>
-  <w:style w:type="paragraph" w:customStyle="1" w:styleId="ActHead9">
-    <w:name w:val="ActHead 9"/>
-    <w:aliases w:val="aat"/>
-    <w:basedOn w:val="Normal"/>
-    <w:next w:val="ItemHead"/>
-    <w:qFormat/>
-    <w:rsid w:val="00CF3BB3"/>
-    <w:pPr>
-      <w:keepNext/>
-      <w:keepLines/>
-      <w:spacing w:before="280" w:after="0" w:line="240" w:lineRule="auto"/>
-      <w:ind w:left="1134" w:hanging="1134"/>
-      <w:outlineLvl w:val="8"/>
-    </w:pPr>
-    <w:rPr>
-      <w:rFonts w:ascii="Times New Roman" w:eastAsia="Times New Roman" w:hAnsi="Times New Roman" w:cs="Times New Roman"/>
-      <w:b/>
-      <w:i/>
-      <w:kern w:val="28"/>
-      <w:sz w:val="28"/>
-      <w:szCs w:val="20"/>
-      <w:lang w:eastAsia="en-AU"/>
-    </w:rPr>
-  </w:style>
-  <w:style w:type="character" w:customStyle="1" w:styleId="CharAmPartNo">
-    <w:name w:val="CharAmPartNo"/>
-    <w:basedOn w:val="DefaultParagraphFont"/>
-    <w:qFormat/>
-    <w:rsid w:val="00CF3BB3"/>
-  </w:style>
-  <w:style w:type="character" w:customStyle="1" w:styleId="CharAmPartText">
-    <w:name w:val="CharAmPartText"/>
-    <w:basedOn w:val="DefaultParagraphFont"/>
-    <w:qFormat/>
-    <w:rsid w:val="00CF3BB3"/>
-  </w:style>
-  <w:style w:type="character" w:customStyle="1" w:styleId="CharAmSchNo">
-    <w:name w:val="CharAmSchNo"/>
-    <w:basedOn w:val="DefaultParagraphFont"/>
-    <w:qFormat/>
-    <w:rsid w:val="00CF3BB3"/>
-  </w:style>
-  <w:style w:type="character" w:customStyle="1" w:styleId="CharAmSchText">
-    <w:name w:val="CharAmSchText"/>
-    <w:basedOn w:val="DefaultParagraphFont"/>
-    <w:qFormat/>
-    <w:rsid w:val="00CF3BB3"/>
-  </w:style>
-  <w:style w:type="paragraph" w:customStyle="1" w:styleId="subsection">
-    <w:name w:val="subsection"/>
-    <w:aliases w:val="ss"/>
-    <w:basedOn w:val="Normal"/>
-    <w:link w:val="subsectionChar"/>
-    <w:rsid w:val="00CF3BB3"/>
-    <w:pPr>
-      <w:tabs>
-        <w:tab w:val="right" w:pos="1021"/>
-      </w:tabs>
-      <w:spacing w:before="180" w:after="0" w:line="240" w:lineRule="auto"/>
-      <w:ind w:left="1134" w:hanging="1134"/>
-    </w:pPr>
-    <w:rPr>
-      <w:rFonts w:ascii="Times New Roman" w:eastAsia="Times New Roman" w:hAnsi="Times New Roman" w:cs="Times New Roman"/>
-      <w:szCs w:val="20"/>
-      <w:lang w:eastAsia="en-AU"/>
-    </w:rPr>
-  </w:style>
-  <w:style w:type="paragraph" w:customStyle="1" w:styleId="Definition">
-    <w:name w:val="Definition"/>
-    <w:aliases w:val="dd"/>
-    <w:basedOn w:val="Normal"/>
-    <w:rsid w:val="00CF3BB3"/>
-    <w:pPr>
-      <w:spacing w:before="180" w:after="0" w:line="240" w:lineRule="auto"/>
-      <w:ind w:left="1134"/>
-    </w:pPr>
-    <w:rPr>
-      <w:rFonts w:ascii="Times New Roman" w:eastAsia="Times New Roman" w:hAnsi="Times New Roman" w:cs="Times New Roman"/>
-      <w:szCs w:val="20"/>
-      <w:lang w:eastAsia="en-AU"/>
-    </w:rPr>
-  </w:style>
-  <w:style w:type="paragraph" w:customStyle="1" w:styleId="Item">
-    <w:name w:val="Item"/>
-    <w:aliases w:val="i"/>
-    <w:basedOn w:val="Normal"/>
-    <w:next w:val="ItemHead"/>
-    <w:rsid w:val="00CF3BB3"/>
-    <w:pPr>
-      <w:keepLines/>
-      <w:spacing w:before="80" w:after="0" w:line="240" w:lineRule="auto"/>
-      <w:ind w:left="709"/>
-    </w:pPr>
-    <w:rPr>
-      <w:rFonts w:ascii="Times New Roman" w:eastAsia="Times New Roman" w:hAnsi="Times New Roman" w:cs="Times New Roman"/>
-      <w:szCs w:val="20"/>
-      <w:lang w:eastAsia="en-AU"/>
-    </w:rPr>
-  </w:style>
-  <w:style w:type="paragraph" w:customStyle="1" w:styleId="ItemHead">
-    <w:name w:val="ItemHead"/>
-    <w:aliases w:val="ih"/>
-    <w:basedOn w:val="Normal"/>
-    <w:next w:val="Item"/>
-    <w:rsid w:val="00CF3BB3"/>
-    <w:pPr>
-      <w:keepNext/>
-      <w:keepLines/>
-      <w:spacing w:before="220" w:after="0" w:line="240" w:lineRule="auto"/>
-      <w:ind w:left="709" w:hanging="709"/>
-    </w:pPr>
-    <w:rPr>
-      <w:rFonts w:ascii="Arial" w:eastAsia="Times New Roman" w:hAnsi="Arial" w:cs="Times New Roman"/>
-      <w:b/>
-      <w:kern w:val="28"/>
-      <w:sz w:val="24"/>
-      <w:szCs w:val="20"/>
-      <w:lang w:eastAsia="en-AU"/>
-    </w:rPr>
-  </w:style>
-  <w:style w:type="paragraph" w:customStyle="1" w:styleId="paragraph">
-    <w:name w:val="paragraph"/>
-    <w:aliases w:val="a"/>
-    <w:basedOn w:val="Normal"/>
-    <w:rsid w:val="00CF3BB3"/>
-    <w:pPr>
-      <w:tabs>
-        <w:tab w:val="right" w:pos="1531"/>
-      </w:tabs>
-      <w:spacing w:before="40" w:after="0" w:line="240" w:lineRule="auto"/>
-      <w:ind w:left="1644" w:hanging="1644"/>
-    </w:pPr>
-    <w:rPr>
-      <w:rFonts w:ascii="Times New Roman" w:eastAsia="Times New Roman" w:hAnsi="Times New Roman" w:cs="Times New Roman"/>
-      <w:szCs w:val="20"/>
-      <w:lang w:eastAsia="en-AU"/>
-    </w:rPr>
-  </w:style>
-  <w:style w:type="paragraph" w:customStyle="1" w:styleId="SubsectionHead">
-    <w:name w:val="SubsectionHead"/>
-    <w:aliases w:val="ssh"/>
-    <w:basedOn w:val="Normal"/>
-    <w:next w:val="subsection"/>
-    <w:rsid w:val="00CF3BB3"/>
-    <w:pPr>
-      <w:keepNext/>
-      <w:keepLines/>
-      <w:spacing w:before="240" w:after="0" w:line="240" w:lineRule="auto"/>
-      <w:ind w:left="1134"/>
-    </w:pPr>
-    <w:rPr>
-      <w:rFonts w:ascii="Times New Roman" w:eastAsia="Times New Roman" w:hAnsi="Times New Roman" w:cs="Times New Roman"/>
-      <w:i/>
-      <w:szCs w:val="20"/>
-      <w:lang w:eastAsia="en-AU"/>
-    </w:rPr>
-  </w:style>
-  <w:style w:type="character" w:customStyle="1" w:styleId="subsectionChar">
-    <w:name w:val="subsection Char"/>
-    <w:aliases w:val="ss Char"/>
-    <w:basedOn w:val="DefaultParagraphFont"/>
-    <w:link w:val="subsection"/>
-    <w:locked/>
-    <w:rsid w:val="00CF3BB3"/>
-    <w:rPr>
-      <w:rFonts w:ascii="Times New Roman" w:eastAsia="Times New Roman" w:hAnsi="Times New Roman" w:cs="Times New Roman"/>
-      <w:szCs w:val="20"/>
-      <w:lang w:eastAsia="en-AU"/>
-    </w:rPr>
+    <w:rsid w:val="00525773"/>
   </w:style>
 </w:styles>
 </file>

</xml_diff>